<commit_message>
Redesign: calmer, editorial look without template tells
- Cool neutral palette with one accent (Kazakh sky blue), Archivo +
  Instrument Sans, Phosphor icons, one consistent shape system
- Light asymmetric hero with photo collage slot; facts strip, editorial
  complaints list, asymmetric tour grid, big-number evidence row
- Removed uppercase mono micro-labels, decorative dots, pills on images,
  dark header bands, section numbering and em-dashes
- Loop shown as a route line; scroll handling via IntersectionObserver
- Report screenshots and Word/PDF regenerated

Co-Authored-By: Claude Opus 5.5 <noreply@anthropic.com>
Claude-Session: https://claude.ai/code/session_01HrYY9Y9MwxQVFQRES5YEHH
</commit_message>
<xml_diff>
--- a/docs/Saryarqa_Go_Report.docx
+++ b/docs/Saryarqa_Go_Report.docx
@@ -2960,7 +2960,7 @@
       <w:r>
         <w:drawing>
           <wp:inline distT="0" distB="0" distL="0" distR="0">
-            <wp:extent cx="5715000" cy="1314450"/>
+            <wp:extent cx="5715000" cy="1266825"/>
             <wp:effectExtent t="0" r="0" b="0" l="0"/>
             <wp:docPr id="1" name="" descr="" title=""/>
             <wp:cNvGraphicFramePr>
@@ -2985,7 +2985,7 @@
                   <pic:spPr bwMode="auto">
                     <a:xfrm>
                       <a:off x="0" y="0"/>
-                      <a:ext cx="5715000" cy="1314450"/>
+                      <a:ext cx="5715000" cy="1266825"/>
                     </a:xfrm>
                     <a:prstGeom prst="rect">
                       <a:avLst/>
@@ -3454,7 +3454,7 @@
       <w:r>
         <w:drawing>
           <wp:inline distT="0" distB="0" distL="0" distR="0">
-            <wp:extent cx="5715000" cy="2724150"/>
+            <wp:extent cx="5715000" cy="3657600"/>
             <wp:effectExtent t="0" r="0" b="0" l="0"/>
             <wp:docPr id="1" name="" descr="" title=""/>
             <wp:cNvGraphicFramePr>
@@ -3479,7 +3479,7 @@
                   <pic:spPr bwMode="auto">
                     <a:xfrm>
                       <a:off x="0" y="0"/>
-                      <a:ext cx="5715000" cy="2724150"/>
+                      <a:ext cx="5715000" cy="3657600"/>
                     </a:xfrm>
                     <a:prstGeom prst="rect">
                       <a:avLst/>
@@ -3517,7 +3517,7 @@
       <w:r>
         <w:drawing>
           <wp:inline distT="0" distB="0" distL="0" distR="0">
-            <wp:extent cx="3514725" cy="3810000"/>
+            <wp:extent cx="3495675" cy="3810000"/>
             <wp:effectExtent t="0" r="0" b="0" l="0"/>
             <wp:docPr id="1" name="" descr="" title=""/>
             <wp:cNvGraphicFramePr>
@@ -3542,7 +3542,7 @@
                   <pic:spPr bwMode="auto">
                     <a:xfrm>
                       <a:off x="0" y="0"/>
-                      <a:ext cx="3514725" cy="3810000"/>
+                      <a:ext cx="3495675" cy="3810000"/>
                     </a:xfrm>
                     <a:prstGeom prst="rect">
                       <a:avLst/>
@@ -5772,7 +5772,7 @@
       <w:r>
         <w:drawing>
           <wp:inline distT="0" distB="0" distL="0" distR="0">
-            <wp:extent cx="5572125" cy="3810000"/>
+            <wp:extent cx="5381625" cy="3810000"/>
             <wp:effectExtent t="0" r="0" b="0" l="0"/>
             <wp:docPr id="1" name="" descr="" title=""/>
             <wp:cNvGraphicFramePr>
@@ -5797,7 +5797,7 @@
                   <pic:spPr bwMode="auto">
                     <a:xfrm>
                       <a:off x="0" y="0"/>
-                      <a:ext cx="5572125" cy="3810000"/>
+                      <a:ext cx="5381625" cy="3810000"/>
                     </a:xfrm>
                     <a:prstGeom prst="rect">
                       <a:avLst/>
@@ -9961,7 +9961,7 @@
       <w:r>
         <w:drawing>
           <wp:inline distT="0" distB="0" distL="0" distR="0">
-            <wp:extent cx="5000625" cy="3810000"/>
+            <wp:extent cx="4800600" cy="3810000"/>
             <wp:effectExtent t="0" r="0" b="0" l="0"/>
             <wp:docPr id="1" name="" descr="" title=""/>
             <wp:cNvGraphicFramePr>
@@ -9986,7 +9986,7 @@
                   <pic:spPr bwMode="auto">
                     <a:xfrm>
                       <a:off x="0" y="0"/>
-                      <a:ext cx="5000625" cy="3810000"/>
+                      <a:ext cx="4800600" cy="3810000"/>
                     </a:xfrm>
                     <a:prstGeom prst="rect">
                       <a:avLst/>
@@ -12477,7 +12477,7 @@
       <w:r>
         <w:drawing>
           <wp:inline distT="0" distB="0" distL="0" distR="0">
-            <wp:extent cx="5715000" cy="3352800"/>
+            <wp:extent cx="5715000" cy="3390900"/>
             <wp:effectExtent t="0" r="0" b="0" l="0"/>
             <wp:docPr id="1" name="" descr="" title=""/>
             <wp:cNvGraphicFramePr>
@@ -12502,7 +12502,7 @@
                   <pic:spPr bwMode="auto">
                     <a:xfrm>
                       <a:off x="0" y="0"/>
-                      <a:ext cx="5715000" cy="3352800"/>
+                      <a:ext cx="5715000" cy="3390900"/>
                     </a:xfrm>
                     <a:prstGeom prst="rect">
                       <a:avLst/>
@@ -12729,7 +12729,7 @@
       <w:r>
         <w:drawing>
           <wp:inline distT="0" distB="0" distL="0" distR="0">
-            <wp:extent cx="4257675" cy="5334000"/>
+            <wp:extent cx="4267200" cy="5334000"/>
             <wp:effectExtent t="0" r="0" b="0" l="0"/>
             <wp:docPr id="1" name="" descr="" title=""/>
             <wp:cNvGraphicFramePr>
@@ -12754,7 +12754,7 @@
                   <pic:spPr bwMode="auto">
                     <a:xfrm>
                       <a:off x="0" y="0"/>
-                      <a:ext cx="4257675" cy="5334000"/>
+                      <a:ext cx="4267200" cy="5334000"/>
                     </a:xfrm>
                     <a:prstGeom prst="rect">
                       <a:avLst/>

</xml_diff>

<commit_message>
Report: clear AI use section (code by AI, report drafted by AI and edited by team)
Co-Authored-By: Claude Opus 5.5 <noreply@anthropic.com>
Claude-Session: https://claude.ai/code/session_01HrYY9Y9MwxQVFQRES5YEHH
</commit_message>
<xml_diff>
--- a/docs/Saryarqa_Go_Report.docx
+++ b/docs/Saryarqa_Go_Report.docx
@@ -612,7 +612,7 @@
         <w:spacing w:after="60"/>
       </w:pPr>
       <w:r>
-        <w:t xml:space="preserve">AI declaration</w:t>
+        <w:t xml:space="preserve">AI use</w:t>
       </w:r>
     </w:p>
     <w:p>
@@ -12370,24 +12370,67 @@
         <w:pStyle w:val="Heading1"/>
       </w:pPr>
       <w:r>
-        <w:t xml:space="preserve">9. AI declaration</w:t>
-      </w:r>
-    </w:p>
-    <w:p>
-      <w:pPr>
-        <w:pBdr>
-          <w:left w:val="single" w:color="0E807A" w:sz="18" w:space="10"/>
-        </w:pBdr>
-        <w:spacing w:after="80"/>
-        <w:ind w:left="360"/>
-      </w:pPr>
-      <w:r>
-        <w:rPr>
-          <w:i w:val="false"/>
-          <w:iCs w:val="false"/>
-          <w:color w:val="2B3550"/>
-        </w:rPr>
-        <w:t xml:space="preserve">We used Claude (Anthropic) as an AI coding assistant to build the clickable prototype (React / TypeScript code, SVG illustrations, scripted concierge logic and the payback calculator) and to draft parts of this report. All case facts, market sources, assumptions and final decisions were checked and are owned by the team.</w:t>
+        <w:t xml:space="preserve">9. AI use</w:t>
+      </w:r>
+    </w:p>
+    <w:p>
+      <w:pPr>
+        <w:spacing w:after="140"/>
+      </w:pPr>
+      <w:r>
+        <w:rPr>
+          <w:b/>
+          <w:bCs/>
+        </w:rPr>
+        <w:t xml:space="preserve">What the AI did.</w:t>
+      </w:r>
+      <w:r>
+        <w:t xml:space="preserve"> We used Claude (Anthropic) mainly as a coding assistant. It wrote the code of the clickable prototype: the React / TypeScript app, the booking flow, the scripted concierge, the trip builder, the payback calculator, the SVG illustrations and the automated tests.</w:t>
+      </w:r>
+    </w:p>
+    <w:p>
+      <w:pPr>
+        <w:spacing w:after="140"/>
+      </w:pPr>
+      <w:r>
+        <w:rPr>
+          <w:b/>
+          <w:bCs/>
+        </w:rPr>
+        <w:t xml:space="preserve">Report text.</w:t>
+      </w:r>
+      <w:r>
+        <w:t xml:space="preserve"> Claude also produced the first draft of this report's text and tables from our brief. The team reviewed and edited it.</w:t>
+      </w:r>
+    </w:p>
+    <w:p>
+      <w:pPr>
+        <w:spacing w:after="140"/>
+      </w:pPr>
+      <w:r>
+        <w:rPr>
+          <w:b/>
+          <w:bCs/>
+        </w:rPr>
+        <w:t xml:space="preserve">What the team did.</w:t>
+      </w:r>
+      <w:r>
+        <w:t xml:space="preserve"> The team chose the product idea, the target market and the features, set the assumptions (margin, budget split), and is responsible for checking every fact, source and number before submission.</w:t>
+      </w:r>
+    </w:p>
+    <w:p>
+      <w:pPr>
+        <w:spacing w:after="140"/>
+      </w:pPr>
+      <w:r>
+        <w:rPr>
+          <w:b/>
+          <w:bCs/>
+        </w:rPr>
+        <w:t xml:space="preserve">What the AI did not do.</w:t>
+      </w:r>
+      <w:r>
+        <w:t xml:space="preserve"> It did not invent statistics, interviews, reviews, licences or partnerships. Every claim carries one of the five labels, and all market figures link to published sources.</w:t>
       </w:r>
     </w:p>
     <w:p>

</xml_diff>

<commit_message>
Judge mode walkthrough (P2.1); report and docs refreshed
- Impact: 'Judge mode: 2-minute walkthrough' steps through the loop with a
  highlight on each page (problem, discover, concierge, trust, book, staff,
  share, money); 3 new checks (157/157, 1 skip)
- REPORT.md test counts; Word/PDF report regenerated; Worker README token wording

Co-Authored-By: Claude Opus 5.5 <noreply@anthropic.com>
Claude-Session: https://claude.ai/code/session_01QhrEeAaLVkc56tMtC6WgXx
</commit_message>
<xml_diff>
--- a/docs/Saryarqa_Go_Report.docx
+++ b/docs/Saryarqa_Go_Report.docx
@@ -70,7 +70,7 @@
           <wp:inline distT="0" distB="0" distL="0" distR="0">
             <wp:extent cx="5715000" cy="3571875"/>
             <wp:effectExtent t="0" r="0" b="0" l="0"/>
-            <wp:docPr id="1" name="" descr="" title=""/>
+            <wp:docPr id="18" name=""/>
             <wp:cNvGraphicFramePr>
               <a:graphicFrameLocks xmlns:a="http://schemas.openxmlformats.org/drawingml/2006/main" noChangeAspect="1"/>
             </wp:cNvGraphicFramePr>
@@ -896,7 +896,7 @@
         <w:t xml:space="preserve">month 44</w:t>
       </w:r>
       <w:r>
-        <w:t xml:space="preserve"> if demand is 30% lower. </w:t>
+        <w:t xml:space="preserve"> if results are 30% lower. </w:t>
       </w:r>
       <w:r>
         <w:rPr>
@@ -930,10 +930,10 @@
           <w:b/>
           <w:bCs/>
         </w:rPr>
-        <w:t xml:space="preserve">75 acceptance checks — all passed</w:t>
-      </w:r>
-      <w:r>
-        <w:t xml:space="preserve">, including the 375 px phone width and dark mode.</w:t>
+        <w:t xml:space="preserve">157 acceptance checks — all passed</w:t>
+      </w:r>
+      <w:r>
+        <w:t xml:space="preserve"> (1 more runs once the offline photos are downloaded), including the 375 px phone width and dark mode.</w:t>
       </w:r>
     </w:p>
     <w:p>
@@ -1102,7 +1102,7 @@
       <w:tr>
         <w:trPr>
           <w:cantSplit/>
-          <w:tblHeader w:val="false"/>
+          <w:tblHeader w:val="off"/>
         </w:trPr>
         <w:tc>
           <w:tcPr>
@@ -1183,7 +1183,7 @@
       <w:tr>
         <w:trPr>
           <w:cantSplit/>
-          <w:tblHeader w:val="false"/>
+          <w:tblHeader w:val="off"/>
         </w:trPr>
         <w:tc>
           <w:tcPr>
@@ -1264,7 +1264,7 @@
       <w:tr>
         <w:trPr>
           <w:cantSplit/>
-          <w:tblHeader w:val="false"/>
+          <w:tblHeader w:val="off"/>
         </w:trPr>
         <w:tc>
           <w:tcPr>
@@ -1345,7 +1345,7 @@
       <w:tr>
         <w:trPr>
           <w:cantSplit/>
-          <w:tblHeader w:val="false"/>
+          <w:tblHeader w:val="off"/>
         </w:trPr>
         <w:tc>
           <w:tcPr>
@@ -1541,7 +1541,7 @@
       <w:tr>
         <w:trPr>
           <w:cantSplit/>
-          <w:tblHeader w:val="false"/>
+          <w:tblHeader w:val="off"/>
         </w:trPr>
         <w:tc>
           <w:tcPr>
@@ -1634,7 +1634,7 @@
       <w:tr>
         <w:trPr>
           <w:cantSplit/>
-          <w:tblHeader w:val="false"/>
+          <w:tblHeader w:val="off"/>
         </w:trPr>
         <w:tc>
           <w:tcPr>
@@ -1718,7 +1718,7 @@
       <w:tr>
         <w:trPr>
           <w:cantSplit/>
-          <w:tblHeader w:val="false"/>
+          <w:tblHeader w:val="off"/>
         </w:trPr>
         <w:tc>
           <w:tcPr>
@@ -1827,7 +1827,7 @@
       <w:tr>
         <w:trPr>
           <w:cantSplit/>
-          <w:tblHeader w:val="false"/>
+          <w:tblHeader w:val="off"/>
         </w:trPr>
         <w:tc>
           <w:tcPr>
@@ -2300,7 +2300,7 @@
       <w:tr>
         <w:trPr>
           <w:cantSplit/>
-          <w:tblHeader w:val="false"/>
+          <w:tblHeader w:val="off"/>
         </w:trPr>
         <w:tc>
           <w:tcPr>
@@ -2408,7 +2408,7 @@
       <w:tr>
         <w:trPr>
           <w:cantSplit/>
-          <w:tblHeader w:val="false"/>
+          <w:tblHeader w:val="off"/>
         </w:trPr>
         <w:tc>
           <w:tcPr>
@@ -2516,7 +2516,7 @@
       <w:tr>
         <w:trPr>
           <w:cantSplit/>
-          <w:tblHeader w:val="false"/>
+          <w:tblHeader w:val="off"/>
         </w:trPr>
         <w:tc>
           <w:tcPr>
@@ -2624,7 +2624,7 @@
       <w:tr>
         <w:trPr>
           <w:cantSplit/>
-          <w:tblHeader w:val="false"/>
+          <w:tblHeader w:val="off"/>
         </w:trPr>
         <w:tc>
           <w:tcPr>
@@ -2732,7 +2732,7 @@
       <w:tr>
         <w:trPr>
           <w:cantSplit/>
-          <w:tblHeader w:val="false"/>
+          <w:tblHeader w:val="off"/>
         </w:trPr>
         <w:tc>
           <w:tcPr>
@@ -2840,7 +2840,7 @@
       <w:tr>
         <w:trPr>
           <w:cantSplit/>
-          <w:tblHeader w:val="false"/>
+          <w:tblHeader w:val="off"/>
         </w:trPr>
         <w:tc>
           <w:tcPr>
@@ -2962,7 +2962,7 @@
           <wp:inline distT="0" distB="0" distL="0" distR="0">
             <wp:extent cx="5715000" cy="1266825"/>
             <wp:effectExtent t="0" r="0" b="0" l="0"/>
-            <wp:docPr id="1" name="" descr="" title=""/>
+            <wp:docPr id="1" name=""/>
             <wp:cNvGraphicFramePr>
               <a:graphicFrameLocks xmlns:a="http://schemas.openxmlformats.org/drawingml/2006/main" noChangeAspect="1"/>
             </wp:cNvGraphicFramePr>
@@ -3115,7 +3115,7 @@
       <w:tr>
         <w:trPr>
           <w:cantSplit/>
-          <w:tblHeader w:val="false"/>
+          <w:tblHeader w:val="off"/>
         </w:trPr>
         <w:tc>
           <w:tcPr>
@@ -3180,7 +3180,7 @@
       <w:tr>
         <w:trPr>
           <w:cantSplit/>
-          <w:tblHeader w:val="false"/>
+          <w:tblHeader w:val="off"/>
         </w:trPr>
         <w:tc>
           <w:tcPr>
@@ -3289,7 +3289,7 @@
       <w:tr>
         <w:trPr>
           <w:cantSplit/>
-          <w:tblHeader w:val="false"/>
+          <w:tblHeader w:val="off"/>
         </w:trPr>
         <w:tc>
           <w:tcPr>
@@ -3354,7 +3354,7 @@
       <w:tr>
         <w:trPr>
           <w:cantSplit/>
-          <w:tblHeader w:val="false"/>
+          <w:tblHeader w:val="off"/>
         </w:trPr>
         <w:tc>
           <w:tcPr>
@@ -3456,7 +3456,7 @@
           <wp:inline distT="0" distB="0" distL="0" distR="0">
             <wp:extent cx="5715000" cy="3657600"/>
             <wp:effectExtent t="0" r="0" b="0" l="0"/>
-            <wp:docPr id="1" name="" descr="" title=""/>
+            <wp:docPr id="2" name=""/>
             <wp:cNvGraphicFramePr>
               <a:graphicFrameLocks xmlns:a="http://schemas.openxmlformats.org/drawingml/2006/main" noChangeAspect="1"/>
             </wp:cNvGraphicFramePr>
@@ -3519,7 +3519,7 @@
           <wp:inline distT="0" distB="0" distL="0" distR="0">
             <wp:extent cx="3495675" cy="3810000"/>
             <wp:effectExtent t="0" r="0" b="0" l="0"/>
-            <wp:docPr id="1" name="" descr="" title=""/>
+            <wp:docPr id="3" name=""/>
             <wp:cNvGraphicFramePr>
               <a:graphicFrameLocks xmlns:a="http://schemas.openxmlformats.org/drawingml/2006/main" noChangeAspect="1"/>
             </wp:cNvGraphicFramePr>
@@ -3776,7 +3776,7 @@
           <wp:inline distT="0" distB="0" distL="0" distR="0">
             <wp:extent cx="5715000" cy="3571875"/>
             <wp:effectExtent t="0" r="0" b="0" l="0"/>
-            <wp:docPr id="1" name="" descr="" title=""/>
+            <wp:docPr id="4" name=""/>
             <wp:cNvGraphicFramePr>
               <a:graphicFrameLocks xmlns:a="http://schemas.openxmlformats.org/drawingml/2006/main" noChangeAspect="1"/>
             </wp:cNvGraphicFramePr>
@@ -3839,7 +3839,7 @@
           <wp:inline distT="0" distB="0" distL="0" distR="0">
             <wp:extent cx="5715000" cy="3571875"/>
             <wp:effectExtent t="0" r="0" b="0" l="0"/>
-            <wp:docPr id="1" name="" descr="" title=""/>
+            <wp:docPr id="5" name=""/>
             <wp:cNvGraphicFramePr>
               <a:graphicFrameLocks xmlns:a="http://schemas.openxmlformats.org/drawingml/2006/main" noChangeAspect="1"/>
             </wp:cNvGraphicFramePr>
@@ -4073,7 +4073,7 @@
       <w:tr>
         <w:trPr>
           <w:cantSplit/>
-          <w:tblHeader w:val="false"/>
+          <w:tblHeader w:val="off"/>
         </w:trPr>
         <w:tc>
           <w:tcPr>
@@ -4129,7 +4129,7 @@
       <w:tr>
         <w:trPr>
           <w:cantSplit/>
-          <w:tblHeader w:val="false"/>
+          <w:tblHeader w:val="off"/>
         </w:trPr>
         <w:tc>
           <w:tcPr>
@@ -4185,7 +4185,7 @@
       <w:tr>
         <w:trPr>
           <w:cantSplit/>
-          <w:tblHeader w:val="false"/>
+          <w:tblHeader w:val="off"/>
         </w:trPr>
         <w:tc>
           <w:tcPr>
@@ -4241,7 +4241,7 @@
       <w:tr>
         <w:trPr>
           <w:cantSplit/>
-          <w:tblHeader w:val="false"/>
+          <w:tblHeader w:val="off"/>
         </w:trPr>
         <w:tc>
           <w:tcPr>
@@ -4297,7 +4297,7 @@
       <w:tr>
         <w:trPr>
           <w:cantSplit/>
-          <w:tblHeader w:val="false"/>
+          <w:tblHeader w:val="off"/>
         </w:trPr>
         <w:tc>
           <w:tcPr>
@@ -4353,7 +4353,7 @@
       <w:tr>
         <w:trPr>
           <w:cantSplit/>
-          <w:tblHeader w:val="false"/>
+          <w:tblHeader w:val="off"/>
         </w:trPr>
         <w:tc>
           <w:tcPr>
@@ -4409,7 +4409,7 @@
       <w:tr>
         <w:trPr>
           <w:cantSplit/>
-          <w:tblHeader w:val="false"/>
+          <w:tblHeader w:val="off"/>
         </w:trPr>
         <w:tc>
           <w:tcPr>
@@ -4465,7 +4465,7 @@
       <w:tr>
         <w:trPr>
           <w:cantSplit/>
-          <w:tblHeader w:val="false"/>
+          <w:tblHeader w:val="off"/>
         </w:trPr>
         <w:tc>
           <w:tcPr>
@@ -4521,7 +4521,7 @@
       <w:tr>
         <w:trPr>
           <w:cantSplit/>
-          <w:tblHeader w:val="false"/>
+          <w:tblHeader w:val="off"/>
         </w:trPr>
         <w:tc>
           <w:tcPr>
@@ -4577,7 +4577,7 @@
       <w:tr>
         <w:trPr>
           <w:cantSplit/>
-          <w:tblHeader w:val="false"/>
+          <w:tblHeader w:val="off"/>
         </w:trPr>
         <w:tc>
           <w:tcPr>
@@ -4633,7 +4633,7 @@
       <w:tr>
         <w:trPr>
           <w:cantSplit/>
-          <w:tblHeader w:val="false"/>
+          <w:tblHeader w:val="off"/>
         </w:trPr>
         <w:tc>
           <w:tcPr>
@@ -4689,7 +4689,7 @@
       <w:tr>
         <w:trPr>
           <w:cantSplit/>
-          <w:tblHeader w:val="false"/>
+          <w:tblHeader w:val="off"/>
         </w:trPr>
         <w:tc>
           <w:tcPr>
@@ -4745,7 +4745,7 @@
       <w:tr>
         <w:trPr>
           <w:cantSplit/>
-          <w:tblHeader w:val="false"/>
+          <w:tblHeader w:val="off"/>
         </w:trPr>
         <w:tc>
           <w:tcPr>
@@ -4816,7 +4816,7 @@
           <w:b/>
           <w:bCs/>
         </w:rPr>
-        <w:t xml:space="preserve">75 / 75 checks passed</w:t>
+        <w:t xml:space="preserve">157 / 157 checks passed, 1 skipped (offline photos)</w:t>
       </w:r>
       <w:r>
         <w:t xml:space="preserve"> (see Appendix C).</w:t>
@@ -4833,7 +4833,7 @@
           <wp:inline distT="0" distB="0" distL="0" distR="0">
             <wp:extent cx="5715000" cy="3571875"/>
             <wp:effectExtent t="0" r="0" b="0" l="0"/>
-            <wp:docPr id="1" name="" descr="" title=""/>
+            <wp:docPr id="6" name=""/>
             <wp:cNvGraphicFramePr>
               <a:graphicFrameLocks xmlns:a="http://schemas.openxmlformats.org/drawingml/2006/main" noChangeAspect="1"/>
             </wp:cNvGraphicFramePr>
@@ -4896,7 +4896,7 @@
           <wp:inline distT="0" distB="0" distL="0" distR="0">
             <wp:extent cx="5715000" cy="3571875"/>
             <wp:effectExtent t="0" r="0" b="0" l="0"/>
-            <wp:docPr id="1" name="" descr="" title=""/>
+            <wp:docPr id="7" name=""/>
             <wp:cNvGraphicFramePr>
               <a:graphicFrameLocks xmlns:a="http://schemas.openxmlformats.org/drawingml/2006/main" noChangeAspect="1"/>
             </wp:cNvGraphicFramePr>
@@ -5095,7 +5095,7 @@
       <w:tr>
         <w:trPr>
           <w:cantSplit/>
-          <w:tblHeader w:val="false"/>
+          <w:tblHeader w:val="off"/>
         </w:trPr>
         <w:tc>
           <w:tcPr>
@@ -5203,7 +5203,7 @@
       <w:tr>
         <w:trPr>
           <w:cantSplit/>
-          <w:tblHeader w:val="false"/>
+          <w:tblHeader w:val="off"/>
         </w:trPr>
         <w:tc>
           <w:tcPr>
@@ -5311,7 +5311,7 @@
       <w:tr>
         <w:trPr>
           <w:cantSplit/>
-          <w:tblHeader w:val="false"/>
+          <w:tblHeader w:val="off"/>
         </w:trPr>
         <w:tc>
           <w:tcPr>
@@ -5419,7 +5419,7 @@
       <w:tr>
         <w:trPr>
           <w:cantSplit/>
-          <w:tblHeader w:val="false"/>
+          <w:tblHeader w:val="off"/>
         </w:trPr>
         <w:tc>
           <w:tcPr>
@@ -5527,7 +5527,7 @@
       <w:tr>
         <w:trPr>
           <w:cantSplit/>
-          <w:tblHeader w:val="false"/>
+          <w:tblHeader w:val="off"/>
         </w:trPr>
         <w:tc>
           <w:tcPr>
@@ -5635,7 +5635,7 @@
       <w:tr>
         <w:trPr>
           <w:cantSplit/>
-          <w:tblHeader w:val="false"/>
+          <w:tblHeader w:val="off"/>
         </w:trPr>
         <w:tc>
           <w:tcPr>
@@ -5774,7 +5774,7 @@
           <wp:inline distT="0" distB="0" distL="0" distR="0">
             <wp:extent cx="5381625" cy="3810000"/>
             <wp:effectExtent t="0" r="0" b="0" l="0"/>
-            <wp:docPr id="1" name="" descr="" title=""/>
+            <wp:docPr id="8" name=""/>
             <wp:cNvGraphicFramePr>
               <a:graphicFrameLocks xmlns:a="http://schemas.openxmlformats.org/drawingml/2006/main" noChangeAspect="1"/>
             </wp:cNvGraphicFramePr>
@@ -5915,7 +5915,7 @@
       <w:tr>
         <w:trPr>
           <w:cantSplit/>
-          <w:tblHeader w:val="false"/>
+          <w:tblHeader w:val="off"/>
         </w:trPr>
         <w:tc>
           <w:tcPr>
@@ -5971,7 +5971,7 @@
       <w:tr>
         <w:trPr>
           <w:cantSplit/>
-          <w:tblHeader w:val="false"/>
+          <w:tblHeader w:val="off"/>
         </w:trPr>
         <w:tc>
           <w:tcPr>
@@ -6027,7 +6027,7 @@
       <w:tr>
         <w:trPr>
           <w:cantSplit/>
-          <w:tblHeader w:val="false"/>
+          <w:tblHeader w:val="off"/>
         </w:trPr>
         <w:tc>
           <w:tcPr>
@@ -6083,7 +6083,7 @@
       <w:tr>
         <w:trPr>
           <w:cantSplit/>
-          <w:tblHeader w:val="false"/>
+          <w:tblHeader w:val="off"/>
         </w:trPr>
         <w:tc>
           <w:tcPr>
@@ -6139,7 +6139,7 @@
       <w:tr>
         <w:trPr>
           <w:cantSplit/>
-          <w:tblHeader w:val="false"/>
+          <w:tblHeader w:val="off"/>
         </w:trPr>
         <w:tc>
           <w:tcPr>
@@ -6195,7 +6195,7 @@
       <w:tr>
         <w:trPr>
           <w:cantSplit/>
-          <w:tblHeader w:val="false"/>
+          <w:tblHeader w:val="off"/>
         </w:trPr>
         <w:tc>
           <w:tcPr>
@@ -6251,7 +6251,7 @@
       <w:tr>
         <w:trPr>
           <w:cantSplit/>
-          <w:tblHeader w:val="false"/>
+          <w:tblHeader w:val="off"/>
         </w:trPr>
         <w:tc>
           <w:tcPr>
@@ -6451,7 +6451,7 @@
       <w:tr>
         <w:trPr>
           <w:cantSplit/>
-          <w:tblHeader w:val="false"/>
+          <w:tblHeader w:val="off"/>
         </w:trPr>
         <w:tc>
           <w:tcPr>
@@ -6532,7 +6532,7 @@
       <w:tr>
         <w:trPr>
           <w:cantSplit/>
-          <w:tblHeader w:val="false"/>
+          <w:tblHeader w:val="off"/>
         </w:trPr>
         <w:tc>
           <w:tcPr>
@@ -6613,7 +6613,7 @@
       <w:tr>
         <w:trPr>
           <w:cantSplit/>
-          <w:tblHeader w:val="false"/>
+          <w:tblHeader w:val="off"/>
         </w:trPr>
         <w:tc>
           <w:tcPr>
@@ -6703,7 +6703,7 @@
       <w:tr>
         <w:trPr>
           <w:cantSplit/>
-          <w:tblHeader w:val="false"/>
+          <w:tblHeader w:val="off"/>
         </w:trPr>
         <w:tc>
           <w:tcPr>
@@ -6784,7 +6784,7 @@
       <w:tr>
         <w:trPr>
           <w:cantSplit/>
-          <w:tblHeader w:val="false"/>
+          <w:tblHeader w:val="off"/>
         </w:trPr>
         <w:tc>
           <w:tcPr>
@@ -6865,7 +6865,7 @@
       <w:tr>
         <w:trPr>
           <w:cantSplit/>
-          <w:tblHeader w:val="false"/>
+          <w:tblHeader w:val="off"/>
         </w:trPr>
         <w:tc>
           <w:tcPr>
@@ -7010,10 +7010,11 @@
         </w:tblBorders>
       </w:tblPr>
       <w:tblGrid>
-        <w:gridCol w:w="4064"/>
-        <w:gridCol w:w="1857"/>
-        <w:gridCol w:w="1857"/>
-        <w:gridCol w:w="1860"/>
+        <w:gridCol w:w="3407"/>
+        <w:gridCol w:w="1557"/>
+        <w:gridCol w:w="1557"/>
+        <w:gridCol w:w="1557"/>
+        <w:gridCol w:w="1560"/>
       </w:tblGrid>
       <w:tr>
         <w:trPr>
@@ -7022,7 +7023,7 @@
         </w:trPr>
         <w:tc>
           <w:tcPr>
-            <w:tcW w:type="dxa" w:w="4064"/>
+            <w:tcW w:type="dxa" w:w="3407"/>
             <w:shd w:fill="12213F" w:color="auto" w:val="clear"/>
             <w:tcMar>
               <w:top w:type="dxa" w:w="70"/>
@@ -7050,7 +7051,7 @@
         </w:tc>
         <w:tc>
           <w:tcPr>
-            <w:tcW w:type="dxa" w:w="1857"/>
+            <w:tcW w:type="dxa" w:w="1557"/>
             <w:shd w:fill="12213F" w:color="auto" w:val="clear"/>
             <w:tcMar>
               <w:top w:type="dxa" w:w="70"/>
@@ -7078,7 +7079,7 @@
         </w:tc>
         <w:tc>
           <w:tcPr>
-            <w:tcW w:type="dxa" w:w="1857"/>
+            <w:tcW w:type="dxa" w:w="1557"/>
             <w:shd w:fill="12213F" w:color="auto" w:val="clear"/>
             <w:tcMar>
               <w:top w:type="dxa" w:w="70"/>
@@ -7106,7 +7107,7 @@
         </w:tc>
         <w:tc>
           <w:tcPr>
-            <w:tcW w:type="dxa" w:w="1860"/>
+            <w:tcW w:type="dxa" w:w="1557"/>
             <w:shd w:fill="12213F" w:color="auto" w:val="clear"/>
             <w:tcMar>
               <w:top w:type="dxa" w:w="70"/>
@@ -7129,6 +7130,34 @@
                 <w:szCs w:val="18"/>
               </w:rPr>
               <w:t xml:space="preserve">Share</w:t>
+            </w:r>
+          </w:p>
+        </w:tc>
+        <w:tc>
+          <w:tcPr>
+            <w:tcW w:type="dxa" w:w="1560"/>
+            <w:shd w:fill="12213F" w:color="auto" w:val="clear"/>
+            <w:tcMar>
+              <w:top w:type="dxa" w:w="70"/>
+              <w:left w:type="dxa" w:w="110"/>
+              <w:bottom w:type="dxa" w:w="70"/>
+              <w:right w:type="dxa" w:w="110"/>
+            </w:tcMar>
+            <w:vAlign w:val="center"/>
+          </w:tcPr>
+          <w:p>
+            <w:pPr>
+              <w:jc w:val="left"/>
+            </w:pPr>
+            <w:r>
+              <w:rPr>
+                <w:b/>
+                <w:bCs/>
+                <w:color w:val="FFFFFF"/>
+                <w:sz w:val="18"/>
+                <w:szCs w:val="18"/>
+              </w:rPr>
+              <w:t xml:space="preserve">Gate</w:t>
             </w:r>
           </w:p>
         </w:tc>
@@ -7136,11 +7165,11 @@
       <w:tr>
         <w:trPr>
           <w:cantSplit/>
-          <w:tblHeader w:val="false"/>
+          <w:tblHeader w:val="off"/>
         </w:trPr>
         <w:tc>
           <w:tcPr>
-            <w:tcW w:type="dxa" w:w="4064"/>
+            <w:tcW w:type="dxa" w:w="3407"/>
             <w:shd w:fill="FFFFFF" w:color="auto" w:val="clear"/>
             <w:tcMar>
               <w:top w:type="dxa" w:w="70"/>
@@ -7165,7 +7194,7 @@
         </w:tc>
         <w:tc>
           <w:tcPr>
-            <w:tcW w:type="dxa" w:w="1857"/>
+            <w:tcW w:type="dxa" w:w="1557"/>
             <w:shd w:fill="FFFFFF" w:color="auto" w:val="clear"/>
             <w:tcMar>
               <w:top w:type="dxa" w:w="70"/>
@@ -7190,7 +7219,7 @@
         </w:tc>
         <w:tc>
           <w:tcPr>
-            <w:tcW w:type="dxa" w:w="1857"/>
+            <w:tcW w:type="dxa" w:w="1557"/>
             <w:shd w:fill="FFFFFF" w:color="auto" w:val="clear"/>
             <w:tcMar>
               <w:top w:type="dxa" w:w="70"/>
@@ -7215,7 +7244,7 @@
         </w:tc>
         <w:tc>
           <w:tcPr>
-            <w:tcW w:type="dxa" w:w="1860"/>
+            <w:tcW w:type="dxa" w:w="1557"/>
             <w:shd w:fill="FFFFFF" w:color="auto" w:val="clear"/>
             <w:tcMar>
               <w:top w:type="dxa" w:w="70"/>
@@ -7235,6 +7264,31 @@
                 <w:szCs w:val="18"/>
               </w:rPr>
               <w:t xml:space="preserve">40.0%</w:t>
+            </w:r>
+          </w:p>
+        </w:tc>
+        <w:tc>
+          <w:tcPr>
+            <w:tcW w:type="dxa" w:w="1560"/>
+            <w:shd w:fill="FFFFFF" w:color="auto" w:val="clear"/>
+            <w:tcMar>
+              <w:top w:type="dxa" w:w="70"/>
+              <w:left w:type="dxa" w:w="110"/>
+              <w:bottom w:type="dxa" w:w="70"/>
+              <w:right w:type="dxa" w:w="110"/>
+            </w:tcMar>
+            <w:vAlign w:val="center"/>
+          </w:tcPr>
+          <w:p>
+            <w:pPr>
+              <w:jc w:val="left"/>
+            </w:pPr>
+            <w:r>
+              <w:rPr>
+                <w:sz w:val="18"/>
+                <w:szCs w:val="18"/>
+              </w:rPr>
+              <w:t xml:space="preserve">1</w:t>
             </w:r>
           </w:p>
         </w:tc>
@@ -7242,11 +7296,11 @@
       <w:tr>
         <w:trPr>
           <w:cantSplit/>
-          <w:tblHeader w:val="false"/>
+          <w:tblHeader w:val="off"/>
         </w:trPr>
         <w:tc>
           <w:tcPr>
-            <w:tcW w:type="dxa" w:w="4064"/>
+            <w:tcW w:type="dxa" w:w="3407"/>
             <w:shd w:fill="FBF8F1" w:color="auto" w:val="clear"/>
             <w:tcMar>
               <w:top w:type="dxa" w:w="70"/>
@@ -7271,7 +7325,7 @@
         </w:tc>
         <w:tc>
           <w:tcPr>
-            <w:tcW w:type="dxa" w:w="1857"/>
+            <w:tcW w:type="dxa" w:w="1557"/>
             <w:shd w:fill="FBF8F1" w:color="auto" w:val="clear"/>
             <w:tcMar>
               <w:top w:type="dxa" w:w="70"/>
@@ -7296,7 +7350,7 @@
         </w:tc>
         <w:tc>
           <w:tcPr>
-            <w:tcW w:type="dxa" w:w="1857"/>
+            <w:tcW w:type="dxa" w:w="1557"/>
             <w:shd w:fill="FBF8F1" w:color="auto" w:val="clear"/>
             <w:tcMar>
               <w:top w:type="dxa" w:w="70"/>
@@ -7321,7 +7375,7 @@
         </w:tc>
         <w:tc>
           <w:tcPr>
-            <w:tcW w:type="dxa" w:w="1860"/>
+            <w:tcW w:type="dxa" w:w="1557"/>
             <w:shd w:fill="FBF8F1" w:color="auto" w:val="clear"/>
             <w:tcMar>
               <w:top w:type="dxa" w:w="70"/>
@@ -7341,6 +7395,31 @@
                 <w:szCs w:val="18"/>
               </w:rPr>
               <w:t xml:space="preserve">7.5%</w:t>
+            </w:r>
+          </w:p>
+        </w:tc>
+        <w:tc>
+          <w:tcPr>
+            <w:tcW w:type="dxa" w:w="1560"/>
+            <w:shd w:fill="FBF8F1" w:color="auto" w:val="clear"/>
+            <w:tcMar>
+              <w:top w:type="dxa" w:w="70"/>
+              <w:left w:type="dxa" w:w="110"/>
+              <w:bottom w:type="dxa" w:w="70"/>
+              <w:right w:type="dxa" w:w="110"/>
+            </w:tcMar>
+            <w:vAlign w:val="center"/>
+          </w:tcPr>
+          <w:p>
+            <w:pPr>
+              <w:jc w:val="left"/>
+            </w:pPr>
+            <w:r>
+              <w:rPr>
+                <w:sz w:val="18"/>
+                <w:szCs w:val="18"/>
+              </w:rPr>
+              <w:t xml:space="preserve">1</w:t>
             </w:r>
           </w:p>
         </w:tc>
@@ -7348,11 +7427,11 @@
       <w:tr>
         <w:trPr>
           <w:cantSplit/>
-          <w:tblHeader w:val="false"/>
+          <w:tblHeader w:val="off"/>
         </w:trPr>
         <w:tc>
           <w:tcPr>
-            <w:tcW w:type="dxa" w:w="4064"/>
+            <w:tcW w:type="dxa" w:w="3407"/>
             <w:shd w:fill="FFFFFF" w:color="auto" w:val="clear"/>
             <w:tcMar>
               <w:top w:type="dxa" w:w="70"/>
@@ -7377,7 +7456,7 @@
         </w:tc>
         <w:tc>
           <w:tcPr>
-            <w:tcW w:type="dxa" w:w="1857"/>
+            <w:tcW w:type="dxa" w:w="1557"/>
             <w:shd w:fill="FFFFFF" w:color="auto" w:val="clear"/>
             <w:tcMar>
               <w:top w:type="dxa" w:w="70"/>
@@ -7402,7 +7481,7 @@
         </w:tc>
         <w:tc>
           <w:tcPr>
-            <w:tcW w:type="dxa" w:w="1857"/>
+            <w:tcW w:type="dxa" w:w="1557"/>
             <w:shd w:fill="FFFFFF" w:color="auto" w:val="clear"/>
             <w:tcMar>
               <w:top w:type="dxa" w:w="70"/>
@@ -7427,7 +7506,7 @@
         </w:tc>
         <w:tc>
           <w:tcPr>
-            <w:tcW w:type="dxa" w:w="1860"/>
+            <w:tcW w:type="dxa" w:w="1557"/>
             <w:shd w:fill="FFFFFF" w:color="auto" w:val="clear"/>
             <w:tcMar>
               <w:top w:type="dxa" w:w="70"/>
@@ -7447,6 +7526,31 @@
                 <w:szCs w:val="18"/>
               </w:rPr>
               <w:t xml:space="preserve">7.5%</w:t>
+            </w:r>
+          </w:p>
+        </w:tc>
+        <w:tc>
+          <w:tcPr>
+            <w:tcW w:type="dxa" w:w="1560"/>
+            <w:shd w:fill="FFFFFF" w:color="auto" w:val="clear"/>
+            <w:tcMar>
+              <w:top w:type="dxa" w:w="70"/>
+              <w:left w:type="dxa" w:w="110"/>
+              <w:bottom w:type="dxa" w:w="70"/>
+              <w:right w:type="dxa" w:w="110"/>
+            </w:tcMar>
+            <w:vAlign w:val="center"/>
+          </w:tcPr>
+          <w:p>
+            <w:pPr>
+              <w:jc w:val="left"/>
+            </w:pPr>
+            <w:r>
+              <w:rPr>
+                <w:sz w:val="18"/>
+                <w:szCs w:val="18"/>
+              </w:rPr>
+              <w:t xml:space="preserve">1</w:t>
             </w:r>
           </w:p>
         </w:tc>
@@ -7454,11 +7558,11 @@
       <w:tr>
         <w:trPr>
           <w:cantSplit/>
-          <w:tblHeader w:val="false"/>
+          <w:tblHeader w:val="off"/>
         </w:trPr>
         <w:tc>
           <w:tcPr>
-            <w:tcW w:type="dxa" w:w="4064"/>
+            <w:tcW w:type="dxa" w:w="3407"/>
             <w:shd w:fill="FBF8F1" w:color="auto" w:val="clear"/>
             <w:tcMar>
               <w:top w:type="dxa" w:w="70"/>
@@ -7483,7 +7587,7 @@
         </w:tc>
         <w:tc>
           <w:tcPr>
-            <w:tcW w:type="dxa" w:w="1857"/>
+            <w:tcW w:type="dxa" w:w="1557"/>
             <w:shd w:fill="FBF8F1" w:color="auto" w:val="clear"/>
             <w:tcMar>
               <w:top w:type="dxa" w:w="70"/>
@@ -7508,7 +7612,7 @@
         </w:tc>
         <w:tc>
           <w:tcPr>
-            <w:tcW w:type="dxa" w:w="1857"/>
+            <w:tcW w:type="dxa" w:w="1557"/>
             <w:shd w:fill="FBF8F1" w:color="auto" w:val="clear"/>
             <w:tcMar>
               <w:top w:type="dxa" w:w="70"/>
@@ -7533,7 +7637,7 @@
         </w:tc>
         <w:tc>
           <w:tcPr>
-            <w:tcW w:type="dxa" w:w="1860"/>
+            <w:tcW w:type="dxa" w:w="1557"/>
             <w:shd w:fill="FBF8F1" w:color="auto" w:val="clear"/>
             <w:tcMar>
               <w:top w:type="dxa" w:w="70"/>
@@ -7553,6 +7657,31 @@
                 <w:szCs w:val="18"/>
               </w:rPr>
               <w:t xml:space="preserve">5.0%</w:t>
+            </w:r>
+          </w:p>
+        </w:tc>
+        <w:tc>
+          <w:tcPr>
+            <w:tcW w:type="dxa" w:w="1560"/>
+            <w:shd w:fill="FBF8F1" w:color="auto" w:val="clear"/>
+            <w:tcMar>
+              <w:top w:type="dxa" w:w="70"/>
+              <w:left w:type="dxa" w:w="110"/>
+              <w:bottom w:type="dxa" w:w="70"/>
+              <w:right w:type="dxa" w:w="110"/>
+            </w:tcMar>
+            <w:vAlign w:val="center"/>
+          </w:tcPr>
+          <w:p>
+            <w:pPr>
+              <w:jc w:val="left"/>
+            </w:pPr>
+            <w:r>
+              <w:rPr>
+                <w:sz w:val="18"/>
+                <w:szCs w:val="18"/>
+              </w:rPr>
+              <w:t xml:space="preserve">1</w:t>
             </w:r>
           </w:p>
         </w:tc>
@@ -7560,11 +7689,11 @@
       <w:tr>
         <w:trPr>
           <w:cantSplit/>
-          <w:tblHeader w:val="false"/>
+          <w:tblHeader w:val="off"/>
         </w:trPr>
         <w:tc>
           <w:tcPr>
-            <w:tcW w:type="dxa" w:w="4064"/>
+            <w:tcW w:type="dxa" w:w="3407"/>
             <w:shd w:fill="FFFFFF" w:color="auto" w:val="clear"/>
             <w:tcMar>
               <w:top w:type="dxa" w:w="70"/>
@@ -7589,7 +7718,7 @@
         </w:tc>
         <w:tc>
           <w:tcPr>
-            <w:tcW w:type="dxa" w:w="1857"/>
+            <w:tcW w:type="dxa" w:w="1557"/>
             <w:shd w:fill="FFFFFF" w:color="auto" w:val="clear"/>
             <w:tcMar>
               <w:top w:type="dxa" w:w="70"/>
@@ -7614,7 +7743,7 @@
         </w:tc>
         <w:tc>
           <w:tcPr>
-            <w:tcW w:type="dxa" w:w="1857"/>
+            <w:tcW w:type="dxa" w:w="1557"/>
             <w:shd w:fill="FFFFFF" w:color="auto" w:val="clear"/>
             <w:tcMar>
               <w:top w:type="dxa" w:w="70"/>
@@ -7639,7 +7768,7 @@
         </w:tc>
         <w:tc>
           <w:tcPr>
-            <w:tcW w:type="dxa" w:w="1860"/>
+            <w:tcW w:type="dxa" w:w="1557"/>
             <w:shd w:fill="FFFFFF" w:color="auto" w:val="clear"/>
             <w:tcMar>
               <w:top w:type="dxa" w:w="70"/>
@@ -7659,6 +7788,31 @@
                 <w:szCs w:val="18"/>
               </w:rPr>
               <w:t xml:space="preserve">22.5%</w:t>
+            </w:r>
+          </w:p>
+        </w:tc>
+        <w:tc>
+          <w:tcPr>
+            <w:tcW w:type="dxa" w:w="1560"/>
+            <w:shd w:fill="FFFFFF" w:color="auto" w:val="clear"/>
+            <w:tcMar>
+              <w:top w:type="dxa" w:w="70"/>
+              <w:left w:type="dxa" w:w="110"/>
+              <w:bottom w:type="dxa" w:w="70"/>
+              <w:right w:type="dxa" w:w="110"/>
+            </w:tcMar>
+            <w:vAlign w:val="center"/>
+          </w:tcPr>
+          <w:p>
+            <w:pPr>
+              <w:jc w:val="left"/>
+            </w:pPr>
+            <w:r>
+              <w:rPr>
+                <w:sz w:val="18"/>
+                <w:szCs w:val="18"/>
+              </w:rPr>
+              <w:t xml:space="preserve">2</w:t>
             </w:r>
           </w:p>
         </w:tc>
@@ -7666,11 +7820,11 @@
       <w:tr>
         <w:trPr>
           <w:cantSplit/>
-          <w:tblHeader w:val="false"/>
+          <w:tblHeader w:val="off"/>
         </w:trPr>
         <w:tc>
           <w:tcPr>
-            <w:tcW w:type="dxa" w:w="4064"/>
+            <w:tcW w:type="dxa" w:w="3407"/>
             <w:shd w:fill="FBF8F1" w:color="auto" w:val="clear"/>
             <w:tcMar>
               <w:top w:type="dxa" w:w="70"/>
@@ -7695,7 +7849,7 @@
         </w:tc>
         <w:tc>
           <w:tcPr>
-            <w:tcW w:type="dxa" w:w="1857"/>
+            <w:tcW w:type="dxa" w:w="1557"/>
             <w:shd w:fill="FBF8F1" w:color="auto" w:val="clear"/>
             <w:tcMar>
               <w:top w:type="dxa" w:w="70"/>
@@ -7720,7 +7874,7 @@
         </w:tc>
         <w:tc>
           <w:tcPr>
-            <w:tcW w:type="dxa" w:w="1857"/>
+            <w:tcW w:type="dxa" w:w="1557"/>
             <w:shd w:fill="FBF8F1" w:color="auto" w:val="clear"/>
             <w:tcMar>
               <w:top w:type="dxa" w:w="70"/>
@@ -7745,7 +7899,7 @@
         </w:tc>
         <w:tc>
           <w:tcPr>
-            <w:tcW w:type="dxa" w:w="1860"/>
+            <w:tcW w:type="dxa" w:w="1557"/>
             <w:shd w:fill="FBF8F1" w:color="auto" w:val="clear"/>
             <w:tcMar>
               <w:top w:type="dxa" w:w="70"/>
@@ -7765,6 +7919,31 @@
                 <w:szCs w:val="18"/>
               </w:rPr>
               <w:t xml:space="preserve">7.5%</w:t>
+            </w:r>
+          </w:p>
+        </w:tc>
+        <w:tc>
+          <w:tcPr>
+            <w:tcW w:type="dxa" w:w="1560"/>
+            <w:shd w:fill="FBF8F1" w:color="auto" w:val="clear"/>
+            <w:tcMar>
+              <w:top w:type="dxa" w:w="70"/>
+              <w:left w:type="dxa" w:w="110"/>
+              <w:bottom w:type="dxa" w:w="70"/>
+              <w:right w:type="dxa" w:w="110"/>
+            </w:tcMar>
+            <w:vAlign w:val="center"/>
+          </w:tcPr>
+          <w:p>
+            <w:pPr>
+              <w:jc w:val="left"/>
+            </w:pPr>
+            <w:r>
+              <w:rPr>
+                <w:sz w:val="18"/>
+                <w:szCs w:val="18"/>
+              </w:rPr>
+              <w:t xml:space="preserve">1</w:t>
             </w:r>
           </w:p>
         </w:tc>
@@ -7772,11 +7951,11 @@
       <w:tr>
         <w:trPr>
           <w:cantSplit/>
-          <w:tblHeader w:val="false"/>
+          <w:tblHeader w:val="off"/>
         </w:trPr>
         <w:tc>
           <w:tcPr>
-            <w:tcW w:type="dxa" w:w="4064"/>
+            <w:tcW w:type="dxa" w:w="3407"/>
             <w:shd w:fill="FFFFFF" w:color="auto" w:val="clear"/>
             <w:tcMar>
               <w:top w:type="dxa" w:w="70"/>
@@ -7801,7 +7980,7 @@
         </w:tc>
         <w:tc>
           <w:tcPr>
-            <w:tcW w:type="dxa" w:w="1857"/>
+            <w:tcW w:type="dxa" w:w="1557"/>
             <w:shd w:fill="FFFFFF" w:color="auto" w:val="clear"/>
             <w:tcMar>
               <w:top w:type="dxa" w:w="70"/>
@@ -7826,7 +8005,7 @@
         </w:tc>
         <w:tc>
           <w:tcPr>
-            <w:tcW w:type="dxa" w:w="1857"/>
+            <w:tcW w:type="dxa" w:w="1557"/>
             <w:shd w:fill="FFFFFF" w:color="auto" w:val="clear"/>
             <w:tcMar>
               <w:top w:type="dxa" w:w="70"/>
@@ -7851,7 +8030,7 @@
         </w:tc>
         <w:tc>
           <w:tcPr>
-            <w:tcW w:type="dxa" w:w="1860"/>
+            <w:tcW w:type="dxa" w:w="1557"/>
             <w:shd w:fill="FFFFFF" w:color="auto" w:val="clear"/>
             <w:tcMar>
               <w:top w:type="dxa" w:w="70"/>
@@ -7871,6 +8050,31 @@
                 <w:szCs w:val="18"/>
               </w:rPr>
               <w:t xml:space="preserve">5.0%</w:t>
+            </w:r>
+          </w:p>
+        </w:tc>
+        <w:tc>
+          <w:tcPr>
+            <w:tcW w:type="dxa" w:w="1560"/>
+            <w:shd w:fill="FFFFFF" w:color="auto" w:val="clear"/>
+            <w:tcMar>
+              <w:top w:type="dxa" w:w="70"/>
+              <w:left w:type="dxa" w:w="110"/>
+              <w:bottom w:type="dxa" w:w="70"/>
+              <w:right w:type="dxa" w:w="110"/>
+            </w:tcMar>
+            <w:vAlign w:val="center"/>
+          </w:tcPr>
+          <w:p>
+            <w:pPr>
+              <w:jc w:val="left"/>
+            </w:pPr>
+            <w:r>
+              <w:rPr>
+                <w:sz w:val="18"/>
+                <w:szCs w:val="18"/>
+              </w:rPr>
+              <w:t xml:space="preserve">1</w:t>
             </w:r>
           </w:p>
         </w:tc>
@@ -7878,11 +8082,11 @@
       <w:tr>
         <w:trPr>
           <w:cantSplit/>
-          <w:tblHeader w:val="false"/>
+          <w:tblHeader w:val="off"/>
         </w:trPr>
         <w:tc>
           <w:tcPr>
-            <w:tcW w:type="dxa" w:w="4064"/>
+            <w:tcW w:type="dxa" w:w="3407"/>
             <w:shd w:fill="FBF8F1" w:color="auto" w:val="clear"/>
             <w:tcMar>
               <w:top w:type="dxa" w:w="70"/>
@@ -7907,7 +8111,7 @@
         </w:tc>
         <w:tc>
           <w:tcPr>
-            <w:tcW w:type="dxa" w:w="1857"/>
+            <w:tcW w:type="dxa" w:w="1557"/>
             <w:shd w:fill="FBF8F1" w:color="auto" w:val="clear"/>
             <w:tcMar>
               <w:top w:type="dxa" w:w="70"/>
@@ -7932,7 +8136,7 @@
         </w:tc>
         <w:tc>
           <w:tcPr>
-            <w:tcW w:type="dxa" w:w="1857"/>
+            <w:tcW w:type="dxa" w:w="1557"/>
             <w:shd w:fill="FBF8F1" w:color="auto" w:val="clear"/>
             <w:tcMar>
               <w:top w:type="dxa" w:w="70"/>
@@ -7957,7 +8161,7 @@
         </w:tc>
         <w:tc>
           <w:tcPr>
-            <w:tcW w:type="dxa" w:w="1860"/>
+            <w:tcW w:type="dxa" w:w="1557"/>
             <w:shd w:fill="FBF8F1" w:color="auto" w:val="clear"/>
             <w:tcMar>
               <w:top w:type="dxa" w:w="70"/>
@@ -7977,6 +8181,31 @@
                 <w:szCs w:val="18"/>
               </w:rPr>
               <w:t xml:space="preserve">5.0%</w:t>
+            </w:r>
+          </w:p>
+        </w:tc>
+        <w:tc>
+          <w:tcPr>
+            <w:tcW w:type="dxa" w:w="1560"/>
+            <w:shd w:fill="FBF8F1" w:color="auto" w:val="clear"/>
+            <w:tcMar>
+              <w:top w:type="dxa" w:w="70"/>
+              <w:left w:type="dxa" w:w="110"/>
+              <w:bottom w:type="dxa" w:w="70"/>
+              <w:right w:type="dxa" w:w="110"/>
+            </w:tcMar>
+            <w:vAlign w:val="center"/>
+          </w:tcPr>
+          <w:p>
+            <w:pPr>
+              <w:jc w:val="left"/>
+            </w:pPr>
+            <w:r>
+              <w:rPr>
+                <w:sz w:val="18"/>
+                <w:szCs w:val="18"/>
+              </w:rPr>
+              <w:t xml:space="preserve">2</w:t>
             </w:r>
           </w:p>
         </w:tc>
@@ -7984,11 +8213,11 @@
       <w:tr>
         <w:trPr>
           <w:cantSplit/>
-          <w:tblHeader w:val="false"/>
+          <w:tblHeader w:val="off"/>
         </w:trPr>
         <w:tc>
           <w:tcPr>
-            <w:tcW w:type="dxa" w:w="4064"/>
+            <w:tcW w:type="dxa" w:w="3407"/>
             <w:shd w:fill="FFFFFF" w:color="auto" w:val="clear"/>
             <w:tcMar>
               <w:top w:type="dxa" w:w="70"/>
@@ -8011,11 +8240,18 @@
               </w:rPr>
               <w:t xml:space="preserve">Total</w:t>
             </w:r>
-          </w:p>
-        </w:tc>
-        <w:tc>
-          <w:tcPr>
-            <w:tcW w:type="dxa" w:w="1857"/>
+            <w:r>
+              <w:rPr>
+                <w:sz w:val="18"/>
+                <w:szCs w:val="18"/>
+              </w:rPr>
+              <w:t xml:space="preserve"> (case limit 20,000,000)</w:t>
+            </w:r>
+          </w:p>
+        </w:tc>
+        <w:tc>
+          <w:tcPr>
+            <w:tcW w:type="dxa" w:w="1557"/>
             <w:shd w:fill="FFFFFF" w:color="auto" w:val="clear"/>
             <w:tcMar>
               <w:top w:type="dxa" w:w="70"/>
@@ -8033,7 +8269,7 @@
         </w:tc>
         <w:tc>
           <w:tcPr>
-            <w:tcW w:type="dxa" w:w="1857"/>
+            <w:tcW w:type="dxa" w:w="1557"/>
             <w:shd w:fill="FFFFFF" w:color="auto" w:val="clear"/>
             <w:tcMar>
               <w:top w:type="dxa" w:w="70"/>
@@ -8060,7 +8296,7 @@
         </w:tc>
         <w:tc>
           <w:tcPr>
-            <w:tcW w:type="dxa" w:w="1860"/>
+            <w:tcW w:type="dxa" w:w="1557"/>
             <w:shd w:fill="FFFFFF" w:color="auto" w:val="clear"/>
             <w:tcMar>
               <w:top w:type="dxa" w:w="70"/>
@@ -8085,6 +8321,24 @@
             </w:r>
           </w:p>
         </w:tc>
+        <w:tc>
+          <w:tcPr>
+            <w:tcW w:type="dxa" w:w="1560"/>
+            <w:shd w:fill="FFFFFF" w:color="auto" w:val="clear"/>
+            <w:tcMar>
+              <w:top w:type="dxa" w:w="70"/>
+              <w:left w:type="dxa" w:w="110"/>
+              <w:bottom w:type="dxa" w:w="70"/>
+              <w:right w:type="dxa" w:w="110"/>
+            </w:tcMar>
+            <w:vAlign w:val="center"/>
+          </w:tcPr>
+          <w:p>
+            <w:pPr>
+              <w:jc w:val="left"/>
+            </w:pPr>
+          </w:p>
+        </w:tc>
       </w:tr>
     </w:tbl>
     <w:p>
@@ -8107,27 +8361,84 @@
         <w:t xml:space="preserve">12,000,000 KZT</w:t>
       </w:r>
       <w:r>
-        <w:t xml:space="preserve">. Recurring year-1 spend + contingency: </w:t>
+        <w:t xml:space="preserve">. Recurring year-1 spend: </w:t>
       </w:r>
       <w:r>
         <w:rPr>
           <w:b/>
           <w:bCs/>
         </w:rPr>
-        <w:t xml:space="preserve">8,000,000 KZT</w:t>
-      </w:r>
-      <w:r>
-        <w:t xml:space="preserve">. After year 1, running cost is assumed at </w:t>
+        <w:t xml:space="preserve">7,000,000 KZT</w:t>
+      </w:r>
+      <w:r>
+        <w:t xml:space="preserve">. Reserve: </w:t>
       </w:r>
       <w:r>
         <w:rPr>
           <w:b/>
           <w:bCs/>
         </w:rPr>
+        <w:t xml:space="preserve">1,000,000 KZT</w:t>
+      </w:r>
+      <w:r>
+        <w:t xml:space="preserve">. After year 1, running cost is assumed at </w:t>
+      </w:r>
+      <w:r>
+        <w:rPr>
+          <w:b/>
+          <w:bCs/>
+        </w:rPr>
         <w:t xml:space="preserve">300,000 KZT/month</w:t>
       </w:r>
       <w:r>
-        <w:t xml:space="preserve">.</w:t>
+        <w:t xml:space="preserve">. All numbers come from one config file (</w:t>
+      </w:r>
+      <w:r>
+        <w:rPr>
+          <w:rFonts w:ascii="Courier New" w:cs="Courier New" w:eastAsia="Courier New" w:hAnsi="Courier New"/>
+          <w:color w:val="0E807A"/>
+          <w:sz w:val="18"/>
+          <w:szCs w:val="18"/>
+        </w:rPr>
+        <w:t xml:space="preserve">src/data/budget.ts</w:t>
+      </w:r>
+      <w:r>
+        <w:t xml:space="preserve">); the build fails if the lines do not add up to the cap.</w:t>
+      </w:r>
+    </w:p>
+    <w:p>
+      <w:pPr>
+        <w:spacing w:after="140"/>
+      </w:pPr>
+      <w:r>
+        <w:rPr>
+          <w:b/>
+          <w:bCs/>
+        </w:rPr>
+        <w:t xml:space="preserve">Staged spending [Proposal].</w:t>
+      </w:r>
+      <w:r>
+        <w:t xml:space="preserve"> The 20,000,000 KZT is a cap, not a target. </w:t>
+      </w:r>
+      <w:r>
+        <w:rPr>
+          <w:b/>
+          <w:bCs/>
+        </w:rPr>
+        <w:t xml:space="preserve">Gate 1</w:t>
+      </w:r>
+      <w:r>
+        <w:t xml:space="preserve"> (14,500,000 KZT: design &amp; development, localization, payment integration, trust content, hosting/AI/maintenance, pilot &amp; support) funds the MVP and the pilot. </w:t>
+      </w:r>
+      <w:r>
+        <w:rPr>
+          <w:b/>
+          <w:bCs/>
+        </w:rPr>
+        <w:t xml:space="preserve">Gate 2</w:t>
+      </w:r>
+      <w:r>
+        <w:t xml:space="preserve"> (5,500,000 KZT: marketing &amp; acquisition, contingency) is released only if the pilot meets its metrics. AI usage (about $0.2–1.1 per 1,000 chats, Needs confirmation) is paid from the existing "Hosting, AI usage, maintenance" line. The payback model still assumes the full budget is spent.</w:t>
       </w:r>
     </w:p>
     <w:p>
@@ -8260,7 +8571,7 @@
       <w:tr>
         <w:trPr>
           <w:cantSplit/>
-          <w:tblHeader w:val="false"/>
+          <w:tblHeader w:val="off"/>
         </w:trPr>
         <w:tc>
           <w:tcPr>
@@ -8341,7 +8652,7 @@
       <w:tr>
         <w:trPr>
           <w:cantSplit/>
-          <w:tblHeader w:val="false"/>
+          <w:tblHeader w:val="off"/>
         </w:trPr>
         <w:tc>
           <w:tcPr>
@@ -8422,7 +8733,7 @@
       <w:tr>
         <w:trPr>
           <w:cantSplit/>
-          <w:tblHeader w:val="false"/>
+          <w:tblHeader w:val="off"/>
         </w:trPr>
         <w:tc>
           <w:tcPr>
@@ -8512,7 +8823,7 @@
       <w:tr>
         <w:trPr>
           <w:cantSplit/>
-          <w:tblHeader w:val="false"/>
+          <w:tblHeader w:val="off"/>
         </w:trPr>
         <w:tc>
           <w:tcPr>
@@ -8593,7 +8904,7 @@
       <w:tr>
         <w:trPr>
           <w:cantSplit/>
-          <w:tblHeader w:val="false"/>
+          <w:tblHeader w:val="off"/>
         </w:trPr>
         <w:tc>
           <w:tcPr>
@@ -8674,7 +8985,7 @@
       <w:tr>
         <w:trPr>
           <w:cantSplit/>
-          <w:tblHeader w:val="false"/>
+          <w:tblHeader w:val="off"/>
         </w:trPr>
         <w:tc>
           <w:tcPr>
@@ -8787,7 +9098,7 @@
         <w:t xml:space="preserve">Costs:</w:t>
       </w:r>
       <w:r>
-        <w:t xml:space="preserve"> 12,000,000 ÷ 3 per month in months 1–3; 8,000,000 ÷ 12 per month in months 1–12; 300,000 per month from month 13.</w:t>
+        <w:t xml:space="preserve"> 12,000,000 (one-time) ÷ 3 per month in months 1–3; 8,000,000 (recurring + reserve) ÷ 12 per month in months 1–12; 300,000 per month from month 13.</w:t>
       </w:r>
     </w:p>
     <w:p>
@@ -8908,9 +9219,9 @@
         </w:tblBorders>
       </w:tblPr>
       <w:tblGrid>
-        <w:gridCol w:w="4620"/>
-        <w:gridCol w:w="2112"/>
-        <w:gridCol w:w="2906"/>
+        <w:gridCol w:w="3930"/>
+        <w:gridCol w:w="1965"/>
+        <w:gridCol w:w="3743"/>
       </w:tblGrid>
       <w:tr>
         <w:trPr>
@@ -8919,7 +9230,7 @@
         </w:trPr>
         <w:tc>
           <w:tcPr>
-            <w:tcW w:type="dxa" w:w="4620"/>
+            <w:tcW w:type="dxa" w:w="3930"/>
             <w:shd w:fill="12213F" w:color="auto" w:val="clear"/>
             <w:tcMar>
               <w:top w:type="dxa" w:w="70"/>
@@ -8937,7 +9248,7 @@
         </w:tc>
         <w:tc>
           <w:tcPr>
-            <w:tcW w:type="dxa" w:w="2112"/>
+            <w:tcW w:type="dxa" w:w="1965"/>
             <w:shd w:fill="12213F" w:color="auto" w:val="clear"/>
             <w:tcMar>
               <w:top w:type="dxa" w:w="70"/>
@@ -8965,7 +9276,7 @@
         </w:tc>
         <w:tc>
           <w:tcPr>
-            <w:tcW w:type="dxa" w:w="2906"/>
+            <w:tcW w:type="dxa" w:w="3743"/>
             <w:shd w:fill="12213F" w:color="auto" w:val="clear"/>
             <w:tcMar>
               <w:top w:type="dxa" w:w="70"/>
@@ -8987,7 +9298,7 @@
                 <w:sz w:val="18"/>
                 <w:szCs w:val="18"/>
               </w:rPr>
-              <w:t xml:space="preserve">Downside (× 0.7)</w:t>
+              <w:t xml:space="preserve">Worse case (−30%, travelers × 0.7)</w:t>
             </w:r>
           </w:p>
         </w:tc>
@@ -8995,11 +9306,11 @@
       <w:tr>
         <w:trPr>
           <w:cantSplit/>
-          <w:tblHeader w:val="false"/>
+          <w:tblHeader w:val="off"/>
         </w:trPr>
         <w:tc>
           <w:tcPr>
-            <w:tcW w:type="dxa" w:w="4620"/>
+            <w:tcW w:type="dxa" w:w="3930"/>
             <w:shd w:fill="FFFFFF" w:color="auto" w:val="clear"/>
             <w:tcMar>
               <w:top w:type="dxa" w:w="70"/>
@@ -9018,13 +9329,13 @@
                 <w:sz w:val="18"/>
                 <w:szCs w:val="18"/>
               </w:rPr>
-              <w:t xml:space="preserve">Lowest cumulative cash (month 12)</w:t>
-            </w:r>
-          </w:p>
-        </w:tc>
-        <w:tc>
-          <w:tcPr>
-            <w:tcW w:type="dxa" w:w="2112"/>
+              <w:t xml:space="preserve">Lowest cumulative cash</w:t>
+            </w:r>
+          </w:p>
+        </w:tc>
+        <w:tc>
+          <w:tcPr>
+            <w:tcW w:type="dxa" w:w="1965"/>
             <w:shd w:fill="FFFFFF" w:color="auto" w:val="clear"/>
             <w:tcMar>
               <w:top w:type="dxa" w:w="70"/>
@@ -9043,13 +9354,13 @@
                 <w:sz w:val="18"/>
                 <w:szCs w:val="18"/>
               </w:rPr>
-              <w:t xml:space="preserve">−17.0M KZT</w:t>
-            </w:r>
-          </w:p>
-        </w:tc>
-        <w:tc>
-          <w:tcPr>
-            <w:tcW w:type="dxa" w:w="2906"/>
+              <w:t xml:space="preserve">−17.0M KZT (month 12)</w:t>
+            </w:r>
+          </w:p>
+        </w:tc>
+        <w:tc>
+          <w:tcPr>
+            <w:tcW w:type="dxa" w:w="3743"/>
             <w:shd w:fill="FFFFFF" w:color="auto" w:val="clear"/>
             <w:tcMar>
               <w:top w:type="dxa" w:w="70"/>
@@ -9068,7 +9379,7 @@
                 <w:sz w:val="18"/>
                 <w:szCs w:val="18"/>
               </w:rPr>
-              <w:t xml:space="preserve">−17.9M KZT</w:t>
+              <w:t xml:space="preserve">−17.9M KZT (month 12)</w:t>
             </w:r>
           </w:p>
         </w:tc>
@@ -9076,11 +9387,11 @@
       <w:tr>
         <w:trPr>
           <w:cantSplit/>
-          <w:tblHeader w:val="false"/>
+          <w:tblHeader w:val="off"/>
         </w:trPr>
         <w:tc>
           <w:tcPr>
-            <w:tcW w:type="dxa" w:w="4620"/>
+            <w:tcW w:type="dxa" w:w="3930"/>
             <w:shd w:fill="FBF8F1" w:color="auto" w:val="clear"/>
             <w:tcMar>
               <w:top w:type="dxa" w:w="70"/>
@@ -9105,7 +9416,7 @@
         </w:tc>
         <w:tc>
           <w:tcPr>
-            <w:tcW w:type="dxa" w:w="2112"/>
+            <w:tcW w:type="dxa" w:w="1965"/>
             <w:shd w:fill="FBF8F1" w:color="auto" w:val="clear"/>
             <w:tcMar>
               <w:top w:type="dxa" w:w="70"/>
@@ -9130,7 +9441,7 @@
         </w:tc>
         <w:tc>
           <w:tcPr>
-            <w:tcW w:type="dxa" w:w="2906"/>
+            <w:tcW w:type="dxa" w:w="3743"/>
             <w:shd w:fill="FBF8F1" w:color="auto" w:val="clear"/>
             <w:tcMar>
               <w:top w:type="dxa" w:w="70"/>
@@ -9157,11 +9468,11 @@
       <w:tr>
         <w:trPr>
           <w:cantSplit/>
-          <w:tblHeader w:val="false"/>
+          <w:tblHeader w:val="off"/>
         </w:trPr>
         <w:tc>
           <w:tcPr>
-            <w:tcW w:type="dxa" w:w="4620"/>
+            <w:tcW w:type="dxa" w:w="3930"/>
             <w:shd w:fill="FFFFFF" w:color="auto" w:val="clear"/>
             <w:tcMar>
               <w:top w:type="dxa" w:w="70"/>
@@ -9188,7 +9499,7 @@
         </w:tc>
         <w:tc>
           <w:tcPr>
-            <w:tcW w:type="dxa" w:w="2112"/>
+            <w:tcW w:type="dxa" w:w="1965"/>
             <w:shd w:fill="FFFFFF" w:color="auto" w:val="clear"/>
             <w:tcMar>
               <w:top w:type="dxa" w:w="70"/>
@@ -9215,7 +9526,7 @@
         </w:tc>
         <w:tc>
           <w:tcPr>
-            <w:tcW w:type="dxa" w:w="2906"/>
+            <w:tcW w:type="dxa" w:w="3743"/>
             <w:shd w:fill="FFFFFF" w:color="auto" w:val="clear"/>
             <w:tcMar>
               <w:top w:type="dxa" w:w="70"/>
@@ -9244,11 +9555,11 @@
       <w:tr>
         <w:trPr>
           <w:cantSplit/>
-          <w:tblHeader w:val="false"/>
+          <w:tblHeader w:val="off"/>
         </w:trPr>
         <w:tc>
           <w:tcPr>
-            <w:tcW w:type="dxa" w:w="4620"/>
+            <w:tcW w:type="dxa" w:w="3930"/>
             <w:shd w:fill="FBF8F1" w:color="auto" w:val="clear"/>
             <w:tcMar>
               <w:top w:type="dxa" w:w="70"/>
@@ -9273,7 +9584,7 @@
         </w:tc>
         <w:tc>
           <w:tcPr>
-            <w:tcW w:type="dxa" w:w="2112"/>
+            <w:tcW w:type="dxa" w:w="1965"/>
             <w:shd w:fill="FBF8F1" w:color="auto" w:val="clear"/>
             <w:tcMar>
               <w:top w:type="dxa" w:w="70"/>
@@ -9298,7 +9609,7 @@
         </w:tc>
         <w:tc>
           <w:tcPr>
-            <w:tcW w:type="dxa" w:w="2906"/>
+            <w:tcW w:type="dxa" w:w="3743"/>
             <w:shd w:fill="FBF8F1" w:color="auto" w:val="clear"/>
             <w:tcMar>
               <w:top w:type="dxa" w:w="70"/>
@@ -9325,11 +9636,11 @@
       <w:tr>
         <w:trPr>
           <w:cantSplit/>
-          <w:tblHeader w:val="false"/>
+          <w:tblHeader w:val="off"/>
         </w:trPr>
         <w:tc>
           <w:tcPr>
-            <w:tcW w:type="dxa" w:w="4620"/>
+            <w:tcW w:type="dxa" w:w="3930"/>
             <w:shd w:fill="FFFFFF" w:color="auto" w:val="clear"/>
             <w:tcMar>
               <w:top w:type="dxa" w:w="70"/>
@@ -9348,13 +9659,13 @@
                 <w:sz w:val="18"/>
                 <w:szCs w:val="18"/>
               </w:rPr>
-              <w:t xml:space="preserve">Break-even travelers (20M ÷ 13,200)</w:t>
-            </w:r>
-          </w:p>
-        </w:tc>
-        <w:tc>
-          <w:tcPr>
-            <w:tcW w:type="dxa" w:w="2112"/>
+              <w:t xml:space="preserve">Break-even travelers (20,000,000 ÷ 13,200)</w:t>
+            </w:r>
+          </w:p>
+        </w:tc>
+        <w:tc>
+          <w:tcPr>
+            <w:tcW w:type="dxa" w:w="1965"/>
             <w:shd w:fill="FFFFFF" w:color="auto" w:val="clear"/>
             <w:tcMar>
               <w:top w:type="dxa" w:w="70"/>
@@ -9379,7 +9690,7 @@
         </w:tc>
         <w:tc>
           <w:tcPr>
-            <w:tcW w:type="dxa" w:w="2906"/>
+            <w:tcW w:type="dxa" w:w="3743"/>
             <w:shd w:fill="FFFFFF" w:color="auto" w:val="clear"/>
             <w:tcMar>
               <w:top w:type="dxa" w:w="70"/>
@@ -9618,7 +9929,7 @@
       <w:tr>
         <w:trPr>
           <w:cantSplit/>
-          <w:tblHeader w:val="false"/>
+          <w:tblHeader w:val="off"/>
         </w:trPr>
         <w:tc>
           <w:tcPr>
@@ -9776,7 +10087,7 @@
       <w:tr>
         <w:trPr>
           <w:cantSplit/>
-          <w:tblHeader w:val="false"/>
+          <w:tblHeader w:val="off"/>
         </w:trPr>
         <w:tc>
           <w:tcPr>
@@ -9799,7 +10110,7 @@
                 <w:sz w:val="18"/>
                 <w:szCs w:val="18"/>
               </w:rPr>
-              <w:t xml:space="preserve">Payback · downside</w:t>
+              <w:t xml:space="preserve">Payback · worse case</w:t>
             </w:r>
           </w:p>
         </w:tc>
@@ -9961,9 +10272,9 @@
       <w:r>
         <w:drawing>
           <wp:inline distT="0" distB="0" distL="0" distR="0">
-            <wp:extent cx="4800600" cy="3810000"/>
+            <wp:extent cx="4667250" cy="3810000"/>
             <wp:effectExtent t="0" r="0" b="0" l="0"/>
-            <wp:docPr id="1" name="" descr="" title=""/>
+            <wp:docPr id="9" name=""/>
             <wp:cNvGraphicFramePr>
               <a:graphicFrameLocks xmlns:a="http://schemas.openxmlformats.org/drawingml/2006/main" noChangeAspect="1"/>
             </wp:cNvGraphicFramePr>
@@ -9986,7 +10297,7 @@
                   <pic:spPr bwMode="auto">
                     <a:xfrm>
                       <a:off x="0" y="0"/>
-                      <a:ext cx="4800600" cy="3810000"/>
+                      <a:ext cx="4667250" cy="3810000"/>
                     </a:xfrm>
                     <a:prstGeom prst="rect">
                       <a:avLst/>
@@ -10428,7 +10739,7 @@
       <w:tr>
         <w:trPr>
           <w:cantSplit/>
-          <w:tblHeader w:val="false"/>
+          <w:tblHeader w:val="off"/>
         </w:trPr>
         <w:tc>
           <w:tcPr>
@@ -10509,7 +10820,7 @@
       <w:tr>
         <w:trPr>
           <w:cantSplit/>
-          <w:tblHeader w:val="false"/>
+          <w:tblHeader w:val="off"/>
         </w:trPr>
         <w:tc>
           <w:tcPr>
@@ -10590,7 +10901,7 @@
       <w:tr>
         <w:trPr>
           <w:cantSplit/>
-          <w:tblHeader w:val="false"/>
+          <w:tblHeader w:val="off"/>
         </w:trPr>
         <w:tc>
           <w:tcPr>
@@ -10671,7 +10982,7 @@
       <w:tr>
         <w:trPr>
           <w:cantSplit/>
-          <w:tblHeader w:val="false"/>
+          <w:tblHeader w:val="off"/>
         </w:trPr>
         <w:tc>
           <w:tcPr>
@@ -10752,7 +11063,7 @@
       <w:tr>
         <w:trPr>
           <w:cantSplit/>
-          <w:tblHeader w:val="false"/>
+          <w:tblHeader w:val="off"/>
         </w:trPr>
         <w:tc>
           <w:tcPr>
@@ -10833,7 +11144,7 @@
       <w:tr>
         <w:trPr>
           <w:cantSplit/>
-          <w:tblHeader w:val="false"/>
+          <w:tblHeader w:val="off"/>
         </w:trPr>
         <w:tc>
           <w:tcPr>
@@ -11099,7 +11410,7 @@
       <w:tr>
         <w:trPr>
           <w:cantSplit/>
-          <w:tblHeader w:val="false"/>
+          <w:tblHeader w:val="off"/>
         </w:trPr>
         <w:tc>
           <w:tcPr>
@@ -11214,7 +11525,7 @@
       <w:tr>
         <w:trPr>
           <w:cantSplit/>
-          <w:tblHeader w:val="false"/>
+          <w:tblHeader w:val="off"/>
         </w:trPr>
         <w:tc>
           <w:tcPr>
@@ -11329,7 +11640,7 @@
       <w:tr>
         <w:trPr>
           <w:cantSplit/>
-          <w:tblHeader w:val="false"/>
+          <w:tblHeader w:val="off"/>
         </w:trPr>
         <w:tc>
           <w:tcPr>
@@ -11444,7 +11755,7 @@
       <w:tr>
         <w:trPr>
           <w:cantSplit/>
-          <w:tblHeader w:val="false"/>
+          <w:tblHeader w:val="off"/>
         </w:trPr>
         <w:tc>
           <w:tcPr>
@@ -11552,7 +11863,7 @@
       <w:tr>
         <w:trPr>
           <w:cantSplit/>
-          <w:tblHeader w:val="false"/>
+          <w:tblHeader w:val="off"/>
         </w:trPr>
         <w:tc>
           <w:tcPr>
@@ -12522,7 +12833,7 @@
           <wp:inline distT="0" distB="0" distL="0" distR="0">
             <wp:extent cx="5715000" cy="3390900"/>
             <wp:effectExtent t="0" r="0" b="0" l="0"/>
-            <wp:docPr id="1" name="" descr="" title=""/>
+            <wp:docPr id="10" name=""/>
             <wp:cNvGraphicFramePr>
               <a:graphicFrameLocks xmlns:a="http://schemas.openxmlformats.org/drawingml/2006/main" noChangeAspect="1"/>
             </wp:cNvGraphicFramePr>
@@ -12585,7 +12896,7 @@
           <wp:inline distT="0" distB="0" distL="0" distR="0">
             <wp:extent cx="5715000" cy="3571875"/>
             <wp:effectExtent t="0" r="0" b="0" l="0"/>
-            <wp:docPr id="1" name="" descr="" title=""/>
+            <wp:docPr id="11" name=""/>
             <wp:cNvGraphicFramePr>
               <a:graphicFrameLocks xmlns:a="http://schemas.openxmlformats.org/drawingml/2006/main" noChangeAspect="1"/>
             </wp:cNvGraphicFramePr>
@@ -12648,7 +12959,7 @@
           <wp:inline distT="0" distB="0" distL="0" distR="0">
             <wp:extent cx="5715000" cy="3571875"/>
             <wp:effectExtent t="0" r="0" b="0" l="0"/>
-            <wp:docPr id="1" name="" descr="" title=""/>
+            <wp:docPr id="12" name=""/>
             <wp:cNvGraphicFramePr>
               <a:graphicFrameLocks xmlns:a="http://schemas.openxmlformats.org/drawingml/2006/main" noChangeAspect="1"/>
             </wp:cNvGraphicFramePr>
@@ -12711,7 +13022,7 @@
           <wp:inline distT="0" distB="0" distL="0" distR="0">
             <wp:extent cx="5715000" cy="3486150"/>
             <wp:effectExtent t="0" r="0" b="0" l="0"/>
-            <wp:docPr id="1" name="" descr="" title=""/>
+            <wp:docPr id="13" name=""/>
             <wp:cNvGraphicFramePr>
               <a:graphicFrameLocks xmlns:a="http://schemas.openxmlformats.org/drawingml/2006/main" noChangeAspect="1"/>
             </wp:cNvGraphicFramePr>
@@ -12772,9 +13083,9 @@
       <w:r>
         <w:drawing>
           <wp:inline distT="0" distB="0" distL="0" distR="0">
-            <wp:extent cx="4267200" cy="5334000"/>
+            <wp:extent cx="4257675" cy="5334000"/>
             <wp:effectExtent t="0" r="0" b="0" l="0"/>
-            <wp:docPr id="1" name="" descr="" title=""/>
+            <wp:docPr id="14" name=""/>
             <wp:cNvGraphicFramePr>
               <a:graphicFrameLocks xmlns:a="http://schemas.openxmlformats.org/drawingml/2006/main" noChangeAspect="1"/>
             </wp:cNvGraphicFramePr>
@@ -12797,7 +13108,7 @@
                   <pic:spPr bwMode="auto">
                     <a:xfrm>
                       <a:off x="0" y="0"/>
-                      <a:ext cx="4267200" cy="5334000"/>
+                      <a:ext cx="4257675" cy="5334000"/>
                     </a:xfrm>
                     <a:prstGeom prst="rect">
                       <a:avLst/>
@@ -12877,7 +13188,7 @@
                 <wp:inline distT="0" distB="0" distL="0" distR="0">
                   <wp:extent cx="1809750" cy="3914775"/>
                   <wp:effectExtent t="0" r="0" b="0" l="0"/>
-                  <wp:docPr id="1" name="" descr="" title=""/>
+                  <wp:docPr id="15" name=""/>
                   <wp:cNvGraphicFramePr>
                     <a:graphicFrameLocks xmlns:a="http://schemas.openxmlformats.org/drawingml/2006/main" noChangeAspect="1"/>
                   </wp:cNvGraphicFramePr>
@@ -12950,7 +13261,7 @@
                 <wp:inline distT="0" distB="0" distL="0" distR="0">
                   <wp:extent cx="1809750" cy="3914775"/>
                   <wp:effectExtent t="0" r="0" b="0" l="0"/>
-                  <wp:docPr id="1" name="" descr="" title=""/>
+                  <wp:docPr id="16" name=""/>
                   <wp:cNvGraphicFramePr>
                     <a:graphicFrameLocks xmlns:a="http://schemas.openxmlformats.org/drawingml/2006/main" noChangeAspect="1"/>
                   </wp:cNvGraphicFramePr>
@@ -13023,7 +13334,7 @@
                 <wp:inline distT="0" distB="0" distL="0" distR="0">
                   <wp:extent cx="1809750" cy="3914775"/>
                   <wp:effectExtent t="0" r="0" b="0" l="0"/>
-                  <wp:docPr id="1" name="" descr="" title=""/>
+                  <wp:docPr id="17" name=""/>
                   <wp:cNvGraphicFramePr>
                     <a:graphicFrameLocks xmlns:a="http://schemas.openxmlformats.org/drawingml/2006/main" noChangeAspect="1"/>
                   </wp:cNvGraphicFramePr>
@@ -13221,17 +13532,17 @@
           <w:b/>
           <w:bCs/>
         </w:rPr>
-        <w:t xml:space="preserve">Automated acceptance test (Playwright): 75 / 75 checks passed</w:t>
+        <w:t xml:space="preserve">Automated acceptance test (Playwright): 157 / 157 checks passed, 1 skipped</w:t>
       </w:r>
       <w:r>
         <w:t xml:space="preserve"> — every loop step, booking validation, decline and success, Chinese answers, the Kolsai + Burabay 8-day plan with the Astana transfer, a budget total of exactly 20,000,000 KZT, payback at months 32 / 44, no horizontal scroll at 375 px on all 12 routes, dark mode, and zero JavaScript errors.</w:t>
       </w:r>
     </w:p>
     <w:sectPr>
-      <w:headerReference w:type="default" r:id="rId7"/>
-      <w:headerReference w:type="first" r:id="rId8"/>
-      <w:footerReference w:type="default" r:id="rId9"/>
-      <w:footerReference w:type="first" r:id="rId10"/>
+      <w:headerReference w:type="default" r:id="rId6"/>
+      <w:headerReference w:type="first" r:id="rId7"/>
+      <w:footerReference w:type="default" r:id="rId8"/>
+      <w:footerReference w:type="first" r:id="rId9"/>
       <w:pgSz w:w="11906" w:h="16838" w:orient="portrait"/>
       <w:pgMar w:top="1134" w:right="1134" w:bottom="1134" w:left="1134" w:header="708" w:footer="708" w:gutter="0"/>
       <w:pgNumType/>
@@ -13240,10 +13551,6 @@
     </w:sectPr>
   </w:body>
 </w:document>
-</file>
-
-<file path=word/comments.xml><?xml version="1.0" encoding="utf-8"?>
-<w:comments xmlns:cx="http://schemas.microsoft.com/office/drawing/2014/chartex" xmlns:cx1="http://schemas.microsoft.com/office/drawing/2015/9/8/chartex" xmlns:cx2="http://schemas.microsoft.com/office/drawing/2015/10/21/chartex" xmlns:cx3="http://schemas.microsoft.com/office/drawing/2016/5/9/chartex" xmlns:cx4="http://schemas.microsoft.com/office/drawing/2016/5/10/chartex" xmlns:cx5="http://schemas.microsoft.com/office/drawing/2016/5/11/chartex" xmlns:cx6="http://schemas.microsoft.com/office/drawing/2016/5/12/chartex" xmlns:cx7="http://schemas.microsoft.com/office/drawing/2016/5/13/chartex" xmlns:cx8="http://schemas.microsoft.com/office/drawing/2016/5/14/chartex" xmlns:mc="http://schemas.openxmlformats.org/markup-compatibility/2006" xmlns:aink="http://schemas.microsoft.com/office/drawing/2016/ink" xmlns:am3d="http://schemas.microsoft.com/office/drawing/2017/model3d" xmlns:o="urn:schemas-microsoft-com:office:office" xmlns:r="http://schemas.openxmlformats.org/officeDocument/2006/relationships" xmlns:m="http://schemas.openxmlformats.org/officeDocument/2006/math" xmlns:v="urn:schemas-microsoft-com:vml" xmlns:wp14="http://schemas.microsoft.com/office/word/2010/wordprocessingDrawing" xmlns:wp="http://schemas.openxmlformats.org/drawingml/2006/wordprocessingDrawing" xmlns:w10="urn:schemas-microsoft-com:office:word" xmlns:w="http://schemas.openxmlformats.org/wordprocessingml/2006/main" xmlns:w14="http://schemas.microsoft.com/office/word/2010/wordml" xmlns:w15="http://schemas.microsoft.com/office/word/2012/wordml" xmlns:w16cex="http://schemas.microsoft.com/office/word/2018/wordml/cex" xmlns:w16cid="http://schemas.microsoft.com/office/word/2016/wordml/cid" xmlns:w16="http://schemas.microsoft.com/office/word/2018/wordml" xmlns:w16sdtdh="http://schemas.microsoft.com/office/word/2020/wordml/sdtdatahash" xmlns:w16se="http://schemas.microsoft.com/office/word/2015/wordml/symex" xmlns:wpg="http://schemas.microsoft.com/office/word/2010/wordprocessingGroup" xmlns:wpi="http://schemas.microsoft.com/office/word/2010/wordprocessingInk" xmlns:wne="http://schemas.microsoft.com/office/word/2006/wordml" xmlns:wps="http://schemas.microsoft.com/office/word/2010/wordprocessingShape"/>
 </file>
 
 <file path=word/endnotes.xml><?xml version="1.0" encoding="utf-8"?>
@@ -13296,8 +13603,29 @@
         <w:szCs w:val="16"/>
       </w:rPr>
       <w:fldChar w:fldCharType="begin"/>
+    </w:r>
+    <w:r>
+      <w:rPr>
+        <w:color w:val="5C6270"/>
+        <w:sz w:val="16"/>
+        <w:szCs w:val="16"/>
+      </w:rPr>
       <w:instrText xml:space="preserve">PAGE</w:instrText>
+    </w:r>
+    <w:r>
+      <w:rPr>
+        <w:color w:val="5C6270"/>
+        <w:sz w:val="16"/>
+        <w:szCs w:val="16"/>
+      </w:rPr>
       <w:fldChar w:fldCharType="separate"/>
+    </w:r>
+    <w:r>
+      <w:rPr>
+        <w:color w:val="5C6270"/>
+        <w:sz w:val="16"/>
+        <w:szCs w:val="16"/>
+      </w:rPr>
       <w:fldChar w:fldCharType="end"/>
     </w:r>
   </w:p>
@@ -13371,7 +13699,7 @@
 <w:numbering xmlns:wpc="http://schemas.microsoft.com/office/word/2010/wordprocessingCanvas" xmlns:mc="http://schemas.openxmlformats.org/markup-compatibility/2006" xmlns:o="urn:schemas-microsoft-com:office:office" xmlns:r="http://schemas.openxmlformats.org/officeDocument/2006/relationships" xmlns:m="http://schemas.openxmlformats.org/officeDocument/2006/math" xmlns:v="urn:schemas-microsoft-com:vml" xmlns:wp14="http://schemas.microsoft.com/office/word/2010/wordprocessingDrawing" xmlns:wp="http://schemas.openxmlformats.org/drawingml/2006/wordprocessingDrawing" xmlns:w10="urn:schemas-microsoft-com:office:word" xmlns:w="http://schemas.openxmlformats.org/wordprocessingml/2006/main" xmlns:w14="http://schemas.microsoft.com/office/word/2010/wordml" xmlns:w15="http://schemas.microsoft.com/office/word/2012/wordml" xmlns:wpg="http://schemas.microsoft.com/office/word/2010/wordprocessingGroup" xmlns:wpi="http://schemas.microsoft.com/office/word/2010/wordprocessingInk" xmlns:wne="http://schemas.microsoft.com/office/word/2006/wordml" xmlns:wps="http://schemas.microsoft.com/office/word/2010/wordprocessingShape" mc:Ignorable="w14 w15 wp14">
   <w:abstractNum w:abstractNumId="1" w15:restartNumberingAfterBreak="0">
     <w:multiLevelType w:val="hybridMultilevel"/>
-    <w:lvl w:ilvl="0" w15:tentative="1">
+    <w:lvl w:ilvl="0" w:tentative="1">
       <w:start w:val="1"/>
       <w:numFmt w:val="bullet"/>
       <w:lvlText w:val="●"/>
@@ -13380,7 +13708,7 @@
         <w:ind w:left="720" w:hanging="360"/>
       </w:pPr>
     </w:lvl>
-    <w:lvl w:ilvl="1" w15:tentative="1">
+    <w:lvl w:ilvl="1" w:tentative="1">
       <w:start w:val="1"/>
       <w:numFmt w:val="bullet"/>
       <w:lvlText w:val="○"/>
@@ -13389,7 +13717,7 @@
         <w:ind w:left="1440" w:hanging="360"/>
       </w:pPr>
     </w:lvl>
-    <w:lvl w:ilvl="2" w15:tentative="1">
+    <w:lvl w:ilvl="2" w:tentative="1">
       <w:start w:val="1"/>
       <w:numFmt w:val="bullet"/>
       <w:lvlText w:val="■"/>
@@ -13398,7 +13726,7 @@
         <w:ind w:left="2160" w:hanging="360"/>
       </w:pPr>
     </w:lvl>
-    <w:lvl w:ilvl="3" w15:tentative="1">
+    <w:lvl w:ilvl="3" w:tentative="1">
       <w:start w:val="1"/>
       <w:numFmt w:val="bullet"/>
       <w:lvlText w:val="●"/>
@@ -13407,7 +13735,7 @@
         <w:ind w:left="2880" w:hanging="360"/>
       </w:pPr>
     </w:lvl>
-    <w:lvl w:ilvl="4" w15:tentative="1">
+    <w:lvl w:ilvl="4" w:tentative="1">
       <w:start w:val="1"/>
       <w:numFmt w:val="bullet"/>
       <w:lvlText w:val="○"/>
@@ -13416,7 +13744,7 @@
         <w:ind w:left="3600" w:hanging="360"/>
       </w:pPr>
     </w:lvl>
-    <w:lvl w:ilvl="5" w15:tentative="1">
+    <w:lvl w:ilvl="5" w:tentative="1">
       <w:start w:val="1"/>
       <w:numFmt w:val="bullet"/>
       <w:lvlText w:val="■"/>
@@ -13425,7 +13753,7 @@
         <w:ind w:left="4320" w:hanging="360"/>
       </w:pPr>
     </w:lvl>
-    <w:lvl w:ilvl="6" w15:tentative="1">
+    <w:lvl w:ilvl="6" w:tentative="1">
       <w:start w:val="1"/>
       <w:numFmt w:val="bullet"/>
       <w:lvlText w:val="●"/>
@@ -13434,7 +13762,7 @@
         <w:ind w:left="5040" w:hanging="360"/>
       </w:pPr>
     </w:lvl>
-    <w:lvl w:ilvl="7" w15:tentative="1">
+    <w:lvl w:ilvl="7" w:tentative="1">
       <w:start w:val="1"/>
       <w:numFmt w:val="bullet"/>
       <w:lvlText w:val="●"/>
@@ -13443,7 +13771,7 @@
         <w:ind w:left="5760" w:hanging="360"/>
       </w:pPr>
     </w:lvl>
-    <w:lvl w:ilvl="8" w15:tentative="1">
+    <w:lvl w:ilvl="8" w:tentative="1">
       <w:start w:val="1"/>
       <w:numFmt w:val="bullet"/>
       <w:lvlText w:val="●"/>
@@ -13455,7 +13783,7 @@
   </w:abstractNum>
   <w:abstractNum w:abstractNumId="2" w15:restartNumberingAfterBreak="0">
     <w:multiLevelType w:val="hybridMultilevel"/>
-    <w:lvl w:ilvl="0" w15:tentative="1">
+    <w:lvl w:ilvl="0" w:tentative="1">
       <w:start w:val="1"/>
       <w:numFmt w:val="bullet"/>
       <w:lvlText w:val="•"/>
@@ -13464,7 +13792,7 @@
         <w:ind w:left="540" w:hanging="270"/>
       </w:pPr>
     </w:lvl>
-    <w:lvl w:ilvl="1" w15:tentative="1">
+    <w:lvl w:ilvl="1" w:tentative="1">
       <w:start w:val="1"/>
       <w:numFmt w:val="bullet"/>
       <w:lvlText w:val="◦"/>
@@ -13476,7 +13804,7 @@
   </w:abstractNum>
   <w:abstractNum w:abstractNumId="3" w15:restartNumberingAfterBreak="0">
     <w:multiLevelType w:val="hybridMultilevel"/>
-    <w:lvl w:ilvl="0" w15:tentative="1">
+    <w:lvl w:ilvl="0" w:tentative="1">
       <w:start w:val="1"/>
       <w:numFmt w:val="bullet"/>
       <w:lvlText w:val="☐"/>
@@ -13488,7 +13816,7 @@
   </w:abstractNum>
   <w:abstractNum w:abstractNumId="4" w15:restartNumberingAfterBreak="0">
     <w:multiLevelType w:val="hybridMultilevel"/>
-    <w:lvl w:ilvl="0" w15:tentative="1">
+    <w:lvl w:ilvl="0" w:tentative="1">
       <w:start w:val="1"/>
       <w:numFmt w:val="decimal"/>
       <w:lvlText w:val="%1."/>
@@ -13513,6 +13841,9 @@
   <w:num w:numId="3">
     <w:abstractNumId w:val="2"/>
     <w:lvlOverride w:ilvl="0">
+      <w:startOverride w:val="1"/>
+    </w:lvlOverride>
+    <w:lvlOverride w:ilvl="1">
       <w:startOverride w:val="1"/>
     </w:lvlOverride>
   </w:num>
@@ -13566,6 +13897,25 @@
       </w:pPr>
     </w:pPrDefault>
   </w:docDefaults>
+  <w:style w:type="paragraph" w:styleId="Normal" w:default="1">
+    <w:name w:val="Normal"/>
+    <w:qFormat/>
+  </w:style>
+  <w:style w:type="table" w:styleId="TableNormal" w:default="true">
+    <w:name w:val="Normal Table"/>
+    <w:uiPriority w:val="99"/>
+    <w:semiHidden/>
+    <w:unhideWhenUsed/>
+    <w:tblPr>
+      <w:tblInd w:type="dxa" w:w="0"/>
+      <w:tblCellMar>
+        <w:top w:type="dxa" w:w="0"/>
+        <w:left w:type="dxa" w:w="108"/>
+        <w:bottom w:type="dxa" w:w="0"/>
+        <w:right w:type="dxa" w:w="108"/>
+      </w:tblCellMar>
+    </w:tblPr>
+  </w:style>
   <w:style w:type="paragraph" w:styleId="Title">
     <w:name w:val="Title"/>
     <w:basedOn w:val="Normal"/>
@@ -13574,28 +13924,6 @@
     <w:rPr>
       <w:sz w:val="56"/>
       <w:szCs w:val="56"/>
-    </w:rPr>
-  </w:style>
-  <w:style w:type="paragraph" w:styleId="Heading1">
-    <w:name w:val="Heading 1"/>
-    <w:basedOn w:val="Normal"/>
-    <w:next w:val="Normal"/>
-    <w:qFormat/>
-    <w:rPr>
-      <w:color w:val="2E74B5"/>
-      <w:sz w:val="32"/>
-      <w:szCs w:val="32"/>
-    </w:rPr>
-  </w:style>
-  <w:style w:type="paragraph" w:styleId="Heading2">
-    <w:name w:val="Heading 2"/>
-    <w:basedOn w:val="Normal"/>
-    <w:next w:val="Normal"/>
-    <w:qFormat/>
-    <w:rPr>
-      <w:color w:val="2E74B5"/>
-      <w:sz w:val="26"/>
-      <w:szCs w:val="26"/>
     </w:rPr>
   </w:style>
   <w:style w:type="paragraph" w:styleId="Heading3">
@@ -13652,6 +13980,139 @@
     <w:name w:val="List Paragraph"/>
     <w:basedOn w:val="Normal"/>
     <w:qFormat/>
+  </w:style>
+  <w:style w:type="paragraph" w:styleId="Caption">
+    <w:name w:val="caption"/>
+    <w:basedOn w:val="Normal"/>
+    <w:next w:val="Normal"/>
+    <w:uiPriority w:val="35"/>
+    <w:semiHidden/>
+    <w:unhideWhenUsed/>
+    <w:qFormat/>
+    <w:pPr>
+      <w:spacing w:after="200"/>
+    </w:pPr>
+    <w:rPr>
+      <w:i/>
+      <w:iCs/>
+      <w:color w:val="44546A" w:themeColor="dark2"/>
+      <w:sz w:val="18"/>
+      <w:szCs w:val="18"/>
+    </w:rPr>
+  </w:style>
+  <w:style w:type="paragraph" w:styleId="Bibliography">
+    <w:name w:val="Bibliography"/>
+    <w:basedOn w:val="Normal"/>
+    <w:next w:val="Normal"/>
+    <w:uiPriority w:val="37"/>
+    <w:unhideWhenUsed/>
+  </w:style>
+  <w:style w:type="paragraph" w:styleId="TOC1">
+    <w:name w:val="toc 1"/>
+    <w:basedOn w:val="Normal"/>
+    <w:next w:val="Normal"/>
+    <w:uiPriority w:val="39"/>
+    <w:semiHidden/>
+    <w:unhideWhenUsed/>
+    <w:pPr>
+      <w:spacing w:after="100"/>
+    </w:pPr>
+  </w:style>
+  <w:style w:type="paragraph" w:styleId="TOC2">
+    <w:name w:val="toc 2"/>
+    <w:basedOn w:val="Normal"/>
+    <w:next w:val="Normal"/>
+    <w:uiPriority w:val="39"/>
+    <w:semiHidden/>
+    <w:unhideWhenUsed/>
+    <w:pPr>
+      <w:spacing w:after="100"/>
+      <w:ind w:left="200"/>
+    </w:pPr>
+  </w:style>
+  <w:style w:type="paragraph" w:styleId="TOC3">
+    <w:name w:val="toc 3"/>
+    <w:basedOn w:val="Normal"/>
+    <w:next w:val="Normal"/>
+    <w:uiPriority w:val="39"/>
+    <w:semiHidden/>
+    <w:unhideWhenUsed/>
+    <w:pPr>
+      <w:spacing w:after="100"/>
+      <w:ind w:left="400"/>
+    </w:pPr>
+  </w:style>
+  <w:style w:type="paragraph" w:styleId="TOC4">
+    <w:name w:val="toc 4"/>
+    <w:basedOn w:val="Normal"/>
+    <w:next w:val="Normal"/>
+    <w:uiPriority w:val="39"/>
+    <w:semiHidden/>
+    <w:unhideWhenUsed/>
+    <w:pPr>
+      <w:spacing w:after="100"/>
+      <w:ind w:left="600"/>
+    </w:pPr>
+  </w:style>
+  <w:style w:type="paragraph" w:styleId="TOC5">
+    <w:name w:val="toc 5"/>
+    <w:basedOn w:val="Normal"/>
+    <w:next w:val="Normal"/>
+    <w:uiPriority w:val="39"/>
+    <w:semiHidden/>
+    <w:unhideWhenUsed/>
+    <w:pPr>
+      <w:spacing w:after="100"/>
+      <w:ind w:left="800"/>
+    </w:pPr>
+  </w:style>
+  <w:style w:type="paragraph" w:styleId="TOC6">
+    <w:name w:val="toc 6"/>
+    <w:basedOn w:val="Normal"/>
+    <w:next w:val="Normal"/>
+    <w:uiPriority w:val="39"/>
+    <w:semiHidden/>
+    <w:unhideWhenUsed/>
+    <w:pPr>
+      <w:spacing w:after="100"/>
+      <w:ind w:left="1000"/>
+    </w:pPr>
+  </w:style>
+  <w:style w:type="paragraph" w:styleId="TOC7">
+    <w:name w:val="toc 7"/>
+    <w:basedOn w:val="Normal"/>
+    <w:next w:val="Normal"/>
+    <w:uiPriority w:val="39"/>
+    <w:semiHidden/>
+    <w:unhideWhenUsed/>
+    <w:pPr>
+      <w:spacing w:after="100"/>
+      <w:ind w:left="1200"/>
+    </w:pPr>
+  </w:style>
+  <w:style w:type="paragraph" w:styleId="TOC8">
+    <w:name w:val="toc 8"/>
+    <w:basedOn w:val="Normal"/>
+    <w:next w:val="Normal"/>
+    <w:uiPriority w:val="39"/>
+    <w:semiHidden/>
+    <w:unhideWhenUsed/>
+    <w:pPr>
+      <w:spacing w:after="100"/>
+      <w:ind w:left="1400"/>
+    </w:pPr>
+  </w:style>
+  <w:style w:type="paragraph" w:styleId="TOC9">
+    <w:name w:val="toc 9"/>
+    <w:basedOn w:val="Normal"/>
+    <w:next w:val="Normal"/>
+    <w:uiPriority w:val="39"/>
+    <w:semiHidden/>
+    <w:unhideWhenUsed/>
+    <w:pPr>
+      <w:spacing w:after="100"/>
+      <w:ind w:left="1600"/>
+    </w:pPr>
   </w:style>
   <w:style w:type="character" w:styleId="Hyperlink">
     <w:name w:val="Hyperlink"/>
@@ -13737,6 +14198,13 @@
       <w:szCs w:val="20"/>
     </w:rPr>
   </w:style>
+  <w:style w:type="character" w:styleId="LineNumber">
+    <w:name w:val="line number"/>
+    <w:basedOn w:val="DefaultParagraphFont"/>
+    <w:uiPriority w:val="99"/>
+    <w:semiHidden/>
+    <w:unhideWhenUsed/>
+  </w:style>
   <w:style w:type="paragraph" w:styleId="Heading1">
     <w:name w:val="Heading 1"/>
     <w:basedOn w:val="Normal"/>
@@ -13778,4 +14246,294 @@
     </w:rPr>
   </w:style>
 </w:styles>
+</file>
+
+<file path=word/theme/theme1.xml><?xml version="1.0" encoding="utf-8"?>
+<a:theme xmlns:a="http://schemas.openxmlformats.org/drawingml/2006/main" name="Office Theme">
+  <a:themeElements>
+    <a:clrScheme name="Office">
+      <a:dk1>
+        <a:sysClr val="windowText" lastClr="000000"/>
+      </a:dk1>
+      <a:lt1>
+        <a:sysClr val="window" lastClr="FFFFFF"/>
+      </a:lt1>
+      <a:dk2>
+        <a:srgbClr val="44546A"/>
+      </a:dk2>
+      <a:lt2>
+        <a:srgbClr val="E7E6E6"/>
+      </a:lt2>
+      <a:accent1>
+        <a:srgbClr val="4472C4"/>
+      </a:accent1>
+      <a:accent2>
+        <a:srgbClr val="ED7D31"/>
+      </a:accent2>
+      <a:accent3>
+        <a:srgbClr val="A5A5A5"/>
+      </a:accent3>
+      <a:accent4>
+        <a:srgbClr val="FFC000"/>
+      </a:accent4>
+      <a:accent5>
+        <a:srgbClr val="5B9BD5"/>
+      </a:accent5>
+      <a:accent6>
+        <a:srgbClr val="70AD47"/>
+      </a:accent6>
+      <a:hlink>
+        <a:srgbClr val="0563C1"/>
+      </a:hlink>
+      <a:folHlink>
+        <a:srgbClr val="954F72"/>
+      </a:folHlink>
+    </a:clrScheme>
+    <a:fontScheme name="Office">
+      <a:majorFont>
+        <a:latin typeface="Calibri Light" panose="020F0302020204030204"/>
+        <a:ea typeface=""/>
+        <a:cs typeface=""/>
+        <a:font script="Jpan" typeface="游ゴシック Light"/>
+        <a:font script="Hang" typeface="맑은 고딕"/>
+        <a:font script="Hans" typeface="等线 Light"/>
+        <a:font script="Hant" typeface="新細明體"/>
+        <a:font script="Arab" typeface="Times New Roman"/>
+        <a:font script="Hebr" typeface="Times New Roman"/>
+        <a:font script="Thai" typeface="Angsana New"/>
+        <a:font script="Ethi" typeface="Nyala"/>
+        <a:font script="Beng" typeface="Vrinda"/>
+        <a:font script="Gujr" typeface="Shruti"/>
+        <a:font script="Khmr" typeface="MoolBoran"/>
+        <a:font script="Knda" typeface="Tunga"/>
+        <a:font script="Guru" typeface="Raavi"/>
+        <a:font script="Cans" typeface="Euphemia"/>
+        <a:font script="Cher" typeface="Plantagenet Cherokee"/>
+        <a:font script="Yiii" typeface="Microsoft Yi Baiti"/>
+        <a:font script="Tibt" typeface="Microsoft Himalaya"/>
+        <a:font script="Thaa" typeface="MV Boli"/>
+        <a:font script="Deva" typeface="Mangal"/>
+        <a:font script="Telu" typeface="Gautami"/>
+        <a:font script="Taml" typeface="Latha"/>
+        <a:font script="Syrc" typeface="Estrangelo Edessa"/>
+        <a:font script="Orya" typeface="Kalinga"/>
+        <a:font script="Mlym" typeface="Kartika"/>
+        <a:font script="Laoo" typeface="DokChampa"/>
+        <a:font script="Sinh" typeface="Iskoola Pota"/>
+        <a:font script="Mong" typeface="Mongolian Baiti"/>
+        <a:font script="Viet" typeface="Times New Roman"/>
+        <a:font script="Uigh" typeface="Microsoft Uighur"/>
+        <a:font script="Geor" typeface="Sylfaen"/>
+        <a:font script="Armn" typeface="Arial"/>
+        <a:font script="Bugi" typeface="Leelawadee UI"/>
+        <a:font script="Bopo" typeface="Microsoft JhengHei"/>
+        <a:font script="Java" typeface="Javanese Text"/>
+        <a:font script="Lisu" typeface="Segoe UI"/>
+        <a:font script="Mymr" typeface="Myanmar Text"/>
+        <a:font script="Nkoo" typeface="Ebrima"/>
+        <a:font script="Olck" typeface="Nirmala UI"/>
+        <a:font script="Osma" typeface="Ebrima"/>
+        <a:font script="Phag" typeface="Phagspa"/>
+        <a:font script="Syrn" typeface="Estrangelo Edessa"/>
+        <a:font script="Syrj" typeface="Estrangelo Edessa"/>
+        <a:font script="Syre" typeface="Estrangelo Edessa"/>
+        <a:font script="Sora" typeface="Nirmala UI"/>
+        <a:font script="Tale" typeface="Microsoft Tai Le"/>
+        <a:font script="Talu" typeface="Microsoft New Tai Lue"/>
+        <a:font script="Tfng" typeface="Ebrima"/>
+      </a:majorFont>
+      <a:minorFont>
+        <a:latin typeface="Calibri" panose="020F0502020204030204"/>
+        <a:ea typeface=""/>
+        <a:cs typeface=""/>
+        <a:font script="Jpan" typeface="游明朝"/>
+        <a:font script="Hang" typeface="맑은 고딕"/>
+        <a:font script="Hans" typeface="等线"/>
+        <a:font script="Hant" typeface="新細明體"/>
+        <a:font script="Arab" typeface="Arial"/>
+        <a:font script="Hebr" typeface="Arial"/>
+        <a:font script="Thai" typeface="Cordia New"/>
+        <a:font script="Ethi" typeface="Nyala"/>
+        <a:font script="Beng" typeface="Vrinda"/>
+        <a:font script="Gujr" typeface="Shruti"/>
+        <a:font script="Khmr" typeface="DaunPenh"/>
+        <a:font script="Knda" typeface="Tunga"/>
+        <a:font script="Guru" typeface="Raavi"/>
+        <a:font script="Cans" typeface="Euphemia"/>
+        <a:font script="Cher" typeface="Plantagenet Cherokee"/>
+        <a:font script="Yiii" typeface="Microsoft Yi Baiti"/>
+        <a:font script="Tibt" typeface="Microsoft Himalaya"/>
+        <a:font script="Thaa" typeface="MV Boli"/>
+        <a:font script="Deva" typeface="Mangal"/>
+        <a:font script="Telu" typeface="Gautami"/>
+        <a:font script="Taml" typeface="Latha"/>
+        <a:font script="Syrc" typeface="Estrangelo Edessa"/>
+        <a:font script="Orya" typeface="Kalinga"/>
+        <a:font script="Mlym" typeface="Kartika"/>
+        <a:font script="Laoo" typeface="DokChampa"/>
+        <a:font script="Sinh" typeface="Iskoola Pota"/>
+        <a:font script="Mong" typeface="Mongolian Baiti"/>
+        <a:font script="Viet" typeface="Arial"/>
+        <a:font script="Uigh" typeface="Microsoft Uighur"/>
+        <a:font script="Geor" typeface="Sylfaen"/>
+        <a:font script="Armn" typeface="Arial"/>
+        <a:font script="Bugi" typeface="Leelawadee UI"/>
+        <a:font script="Bopo" typeface="Microsoft JhengHei"/>
+        <a:font script="Java" typeface="Javanese Text"/>
+        <a:font script="Lisu" typeface="Segoe UI"/>
+        <a:font script="Mymr" typeface="Myanmar Text"/>
+        <a:font script="Nkoo" typeface="Ebrima"/>
+        <a:font script="Olck" typeface="Nirmala UI"/>
+        <a:font script="Osma" typeface="Ebrima"/>
+        <a:font script="Phag" typeface="Phagspa"/>
+        <a:font script="Syrn" typeface="Estrangelo Edessa"/>
+        <a:font script="Syrj" typeface="Estrangelo Edessa"/>
+        <a:font script="Syre" typeface="Estrangelo Edessa"/>
+        <a:font script="Sora" typeface="Nirmala UI"/>
+        <a:font script="Tale" typeface="Microsoft Tai Le"/>
+        <a:font script="Talu" typeface="Microsoft New Tai Lue"/>
+        <a:font script="Tfng" typeface="Ebrima"/>
+      </a:minorFont>
+    </a:fontScheme>
+    <a:fmtScheme name="Office">
+      <a:fillStyleLst>
+        <a:solidFill>
+          <a:schemeClr val="phClr"/>
+        </a:solidFill>
+        <a:gradFill rotWithShape="true">
+          <a:gsLst>
+            <a:gs pos="0">
+              <a:schemeClr val="phClr">
+                <a:lumMod val="110000"/>
+                <a:satMod val="105000"/>
+                <a:tint val="67000"/>
+              </a:schemeClr>
+            </a:gs>
+            <a:gs pos="50000">
+              <a:schemeClr val="phClr">
+                <a:lumMod val="105000"/>
+                <a:satMod val="103000"/>
+                <a:tint val="73000"/>
+              </a:schemeClr>
+            </a:gs>
+            <a:gs pos="100000">
+              <a:schemeClr val="phClr">
+                <a:lumMod val="105000"/>
+                <a:satMod val="109000"/>
+                <a:tint val="81000"/>
+              </a:schemeClr>
+            </a:gs>
+          </a:gsLst>
+          <a:lin ang="5400000" scaled="false"/>
+        </a:gradFill>
+        <a:gradFill rotWithShape="true">
+          <a:gsLst>
+            <a:gs pos="0">
+              <a:schemeClr val="phClr">
+                <a:satMod val="103000"/>
+                <a:lumMod val="102000"/>
+                <a:tint val="94000"/>
+              </a:schemeClr>
+            </a:gs>
+            <a:gs pos="50000">
+              <a:schemeClr val="phClr">
+                <a:satMod val="110000"/>
+                <a:lumMod val="100000"/>
+                <a:shade val="100000"/>
+              </a:schemeClr>
+            </a:gs>
+            <a:gs pos="100000">
+              <a:schemeClr val="phClr">
+                <a:lumMod val="99000"/>
+                <a:satMod val="120000"/>
+                <a:shade val="78000"/>
+              </a:schemeClr>
+            </a:gs>
+          </a:gsLst>
+          <a:lin ang="5400000" scaled="false"/>
+        </a:gradFill>
+      </a:fillStyleLst>
+      <a:lnStyleLst>
+        <a:ln w="6350" cap="flat" cmpd="sng" algn="ctr">
+          <a:solidFill>
+            <a:schemeClr val="phClr"/>
+          </a:solidFill>
+          <a:prstDash val="solid"/>
+          <a:miter lim="800000"/>
+        </a:ln>
+        <a:ln w="12700" cap="flat" cmpd="sng" algn="ctr">
+          <a:solidFill>
+            <a:schemeClr val="phClr"/>
+          </a:solidFill>
+          <a:prstDash val="solid"/>
+          <a:miter lim="800000"/>
+        </a:ln>
+        <a:ln w="19050" cap="flat" cmpd="sng" algn="ctr">
+          <a:solidFill>
+            <a:schemeClr val="phClr"/>
+          </a:solidFill>
+          <a:prstDash val="solid"/>
+          <a:miter lim="800000"/>
+        </a:ln>
+      </a:lnStyleLst>
+      <a:effectStyleLst>
+        <a:effectStyle>
+          <a:effectLst/>
+        </a:effectStyle>
+        <a:effectStyle>
+          <a:effectLst/>
+        </a:effectStyle>
+        <a:effectStyle>
+          <a:effectLst>
+            <a:outerShdw blurRad="57150" dist="19050" dir="5400000" algn="ctr" rotWithShape="false">
+              <a:srgbClr val="000000">
+                <a:alpha val="63000"/>
+              </a:srgbClr>
+            </a:outerShdw>
+          </a:effectLst>
+        </a:effectStyle>
+      </a:effectStyleLst>
+      <a:bgFillStyleLst>
+        <a:solidFill>
+          <a:schemeClr val="phClr"/>
+        </a:solidFill>
+        <a:solidFill>
+          <a:schemeClr val="phClr">
+            <a:tint val="95000"/>
+            <a:satMod val="170000"/>
+          </a:schemeClr>
+        </a:solidFill>
+        <a:gradFill rotWithShape="true">
+          <a:gsLst>
+            <a:gs pos="0">
+              <a:schemeClr val="phClr">
+                <a:tint val="93000"/>
+                <a:satMod val="150000"/>
+                <a:shade val="98000"/>
+                <a:lumMod val="102000"/>
+              </a:schemeClr>
+            </a:gs>
+            <a:gs pos="50000">
+              <a:schemeClr val="phClr">
+                <a:tint val="98000"/>
+                <a:satMod val="130000"/>
+                <a:shade val="90000"/>
+                <a:lumMod val="103000"/>
+              </a:schemeClr>
+            </a:gs>
+            <a:gs pos="100000">
+              <a:schemeClr val="phClr">
+                <a:shade val="63000"/>
+                <a:satMod val="120000"/>
+              </a:schemeClr>
+            </a:gs>
+          </a:gsLst>
+          <a:lin ang="5400000" scaled="false"/>
+        </a:gradFill>
+      </a:bgFillStyleLst>
+    </a:fmtScheme>
+  </a:themeElements>
+  <a:objectDefaults/>
+  <a:extraClrSchemeLst/>
+</a:theme>
 </file>
</xml_diff>